<commit_message>
docs: refine Praxis research narrative and verify final reading edition
</commit_message>
<xml_diff>
--- a/dissertation/2026-10-15/manuscript/Tallam_Krti_Praxis_Strengthened_2026-10-15.docx
+++ b/dissertation/2026-10-15/manuscript/Tallam_Krti_Praxis_Strengthened_2026-10-15.docx
@@ -310,7 +310,7 @@
         <w:ind w:firstLine="720"/>
       </w:pPr>
       <w:r>
-        <w:t xml:space="preserve">This Praxis establishes an empirical design basis for cascaded uniform resource locator (URL) phishing detection through CyberSentinel, a system combining structural classification, a character transformer and distribution monitoring. Three research questions connect representation, monitoring and selective execution to detection quality and service cost. Paired cross-dataset comparisons, controlled input interventions and service measurements explain how these design choices affect system behavior. Structural features increase internal recall by 64.07 percentage points. Validation controls reveal a strong association between URL format and class labels, while fixed-weight interventions establish sensitivity to scheme spelling. Together, these findings identify representation dependence without assigning an unmeasured share of the internal gain to format. Paired model outputs establish a 90.5487% false-positive floor for routing between unchanged decisions on the evaluated external cohort, making the expert’s available corrections a measurable design constraint. Monitoring detects 87.12% of external windows, while escalation adds 218 false positives without additional gold-positive detections, demonstrating the importance of evaluating alerts through their resulting decisions. Controlled service experiments identify an effective implementation change: worker-owned clients reduce median paired 95th-percentile latency by 79.68% in single-host synthetic structural-only measurements, with a no-model control supporting the client-path explanation. The resulting contribution is concrete engineering guidance: evaluate representation stability alongside detection, select experts for useful corrections, measure monitoring through response outcomes, and target execution costs identified by controlled measurement.</w:t>
+        <w:t xml:space="preserve">This Praxis builds and tests CyberSentinel, a uniform resource locator (URL) phishing gateway combining structural classification, a character transformer, distribution monitoring and a Hypertext Transfer Protocol (HTTP) service. Internal structural recall reaches 98.6807% at a 0.7747% false-positive rate, a 64.07-percentage-point gain over length alone. Controlled experiments explain the system's behavior and test improvements. Validation labels are strongly associated with URL format, and scheme spelling changes frozen-model decisions; these tests do not quantify the format's share of the internal gain. On the evaluated external cohort, shared errors impose an exact 90.5487% false-positive floor on routing between unchanged decisions. Monitoring recognizes 87.12% of external windows, exceeding its sensitivity target, while audit false alerts exceed their limit. Escalation adds 218 false positives without another gold detection, establishing the need to evaluate alerts and subsequent decisions separately. In single-host synthetic structural-only service tests, worker-owned clients reduce median paired 95th-percentile latency by 79.68%, preserving every comparable prediction. A no-model control supports the client-path explanation. The complete gateway did not meet its prespecified joint hypotheses; the experiments identify the governing constraints and test concrete remedies. CyberSentinel contributes a working architecture, a measured service improvement, a benchmark-format check and an exact bound that guides expert selection.</w:t>
       </w:r>
     </w:p>
     <w:p>
@@ -418,7 +418,7 @@
       </w:hyperlink>
       <w:hyperlink w:anchor="list_figures">
         <w:r>
-          <w:t>xiv</w:t>
+          <w:t>xiii</w:t>
         </w:r>
       </w:hyperlink>
     </w:p>
@@ -441,7 +441,7 @@
       </w:hyperlink>
       <w:hyperlink w:anchor="list_tables">
         <w:r>
-          <w:t>xv</w:t>
+          <w:t>xiv</w:t>
         </w:r>
       </w:hyperlink>
     </w:p>
@@ -464,7 +464,7 @@
       </w:hyperlink>
       <w:hyperlink w:anchor="symbols">
         <w:r>
-          <w:t>xviii</w:t>
+          <w:t>xvii</w:t>
         </w:r>
       </w:hyperlink>
     </w:p>
@@ -487,7 +487,7 @@
       </w:hyperlink>
       <w:hyperlink w:anchor="acronyms">
         <w:r>
-          <w:t>xix</w:t>
+          <w:t>xviii</w:t>
         </w:r>
       </w:hyperlink>
     </w:p>
@@ -510,7 +510,7 @@
       </w:hyperlink>
       <w:hyperlink w:anchor="glossary">
         <w:r>
-          <w:t>xxii</w:t>
+          <w:t>xxi</w:t>
         </w:r>
       </w:hyperlink>
     </w:p>
@@ -1003,7 +1003,7 @@
         <w:fldChar w:fldCharType="separate"/>
       </w:r>
       <w:r>
-        <w:t>10</w:t>
+        <w:t>11</w:t>
       </w:r>
       <w:r>
         <w:fldChar w:fldCharType="end"/>
@@ -2628,7 +2628,7 @@
         <w:fldChar w:fldCharType="separate"/>
       </w:r>
       <w:r>
-        <w:t>81</w:t>
+        <w:t>80</w:t>
       </w:r>
       <w:r>
         <w:fldChar w:fldCharType="end"/>
@@ -2694,7 +2694,7 @@
         <w:fldChar w:fldCharType="separate"/>
       </w:r>
       <w:r>
-        <w:t>84</w:t>
+        <w:t>83</w:t>
       </w:r>
       <w:r>
         <w:fldChar w:fldCharType="end"/>
@@ -3123,7 +3123,7 @@
         <w:fldChar w:fldCharType="separate"/>
       </w:r>
       <w:r>
-        <w:t>103</w:t>
+        <w:t>104</w:t>
       </w:r>
       <w:r>
         <w:fldChar w:fldCharType="end"/>
@@ -3751,7 +3751,7 @@
         <w:fldChar w:fldCharType="separate"/>
       </w:r>
       <w:r>
-        <w:t>55</w:t>
+        <w:t>54</w:t>
       </w:r>
       <w:r>
         <w:fldChar w:fldCharType="end"/>
@@ -4246,7 +4246,7 @@
         <w:fldChar w:fldCharType="separate"/>
       </w:r>
       <w:r>
-        <w:t>85</w:t>
+        <w:t>84</w:t>
       </w:r>
       <w:r>
         <w:fldChar w:fldCharType="end"/>
@@ -5205,15 +5205,7 @@
         <w:ind w:firstLine="720"/>
       </w:pPr>
       <w:r>
-        <w:t xml:space="preserve">The central engineering task is to determine which learned signals transfer and which interventions improve decisions. Domain separation tests performance beyond the training domains, while evaluation across sources examines the influence of shared collection conventions. Paired expert decisions identify where routing can help. </w:t>
-      </w:r>
-      <w:proofErr w:type="spellStart"/>
-      <w:r>
-        <w:t>CyberSentinel</w:t>
-      </w:r>
-      <w:proofErr w:type="spellEnd"/>
-      <w:r>
-        <w:t xml:space="preserve"> brings these questions into one evaluation of representation, routing and monitoring.</w:t>
+        <w:t xml:space="preserve">CyberSentinel makes three design choices testable: what information to extract from a URL, when to invoke an expert and how to respond to changed inputs. Domain-separated testing evaluates unseen domains; evaluation across sources probes collection conventions that domain separation can preserve. Comparing both models on identical inputs establishes which decisions the expert can improve.</w:t>
       </w:r>
     </w:p>
     <w:p>
@@ -5240,39 +5232,18 @@
         <w:rPr>
           <w:i/>
         </w:rPr>
-        <w:t xml:space="preserve">An inline phishing gateway must detect threats, limit false warnings and respond promptly. The design challenge is to make those requirements work together: expert calls consume resources, and recall gains must justify their false-alert cost. This study evaluates a low-cost structural detector, selective character-model execution and </w:t>
-      </w:r>
+        <w:t xml:space="preserve">An inline phishing gateway must detect threats, limit false warnings and respond promptly. A cheap first model saves computation; an expert may recognize patterns it misses. A distribution monitor flags inputs that differ from the training reference. CyberSentinel tests these components together under joint detection and service constraints. Each must earn its place through better decisions or lower cost.</w:t>
+      </w:r>
+    </w:p>
+    <w:p>
+      <w:pPr>
+        <w:ind w:firstLine="720"/>
+      </w:pPr>
       <w:r>
         <w:rPr>
           <w:i/>
         </w:rPr>
-        <w:lastRenderedPageBreak/>
-        <w:t>distribution monitoring against joint detection and service constraints. That joint evaluation gives each component's contribution an operational meaning.</w:t>
-      </w:r>
-    </w:p>
-    <w:p>
-      <w:pPr>
-        <w:ind w:firstLine="720"/>
-      </w:pPr>
-      <w:r>
-        <w:rPr>
-          <w:i/>
-        </w:rPr>
-        <w:t xml:space="preserve">Selecting an effective intervention requires locating the behavior it should change. Collection-specific cues, threshold transfer and shared expert errors suggest different detection interventions; request handling presents a separate opportunity to reduce delay. Paired decisions and controlled comparisons distinguish these explanations in </w:t>
-      </w:r>
-      <w:proofErr w:type="spellStart"/>
-      <w:r>
-        <w:rPr>
-          <w:i/>
-        </w:rPr>
-        <w:t>CyberSentinel</w:t>
-      </w:r>
-      <w:proofErr w:type="spellEnd"/>
-      <w:r>
-        <w:rPr>
-          <w:i/>
-        </w:rPr>
-        <w:t xml:space="preserve">. </w:t>
+        <w:t xml:space="preserve">The engineering question is which change addresses the observed behavior. Collection-specific cues, threshold transfer and shared model errors require different tests. Delay can also arise outside the classifiers. Paired decisions and controlled comparisons examine these possibilities separately. </w:t>
       </w:r>
       <w:hyperlink w:anchor="heading_23" w:history="1">
         <w:r>
@@ -5286,7 +5257,7 @@
         <w:rPr>
           <w:i/>
         </w:rPr>
-        <w:t xml:space="preserve"> defines the evaluated populations and the limitations of their labels.</w:t>
+        <w:t xml:space="preserve"> defines the populations and reference-label limitations.</w:t>
       </w:r>
     </w:p>
     <w:p>
@@ -5363,8 +5334,7 @@
         <w:ind w:firstLine="720"/>
       </w:pPr>
       <w:r>
-        <w:lastRenderedPageBreak/>
-        <w:t>Each research question informs a design decision. Paired comparisons measure representation value; scheme interventions test format dependence. Monitoring replay and routing comparisons measure useful expert corrections. Shuffled-label controls explain validation ranking, while client and computation measurements locate execution costs.</w:t>
+        <w:t xml:space="preserve">Each research question leads to a design test. Paired model comparisons measure the feature gain; scheme interventions test format dependence. Monitoring replay follows alerts into decisions, and routing comparisons count expert corrections. Shuffled-label controls examine validation ranking. Client and computation tests locate execution costs.</w:t>
       </w:r>
     </w:p>
     <w:p>
@@ -5382,19 +5352,11 @@
       <w:pPr>
         <w:ind w:firstLine="720"/>
       </w:pPr>
-      <w:proofErr w:type="spellStart"/>
       <w:r>
         <w:rPr>
           <w:i/>
         </w:rPr>
-        <w:t>CyberSentinel</w:t>
-      </w:r>
-      <w:proofErr w:type="spellEnd"/>
-      <w:r>
-        <w:rPr>
-          <w:i/>
-        </w:rPr>
-        <w:t xml:space="preserve"> connects URL representation, monitoring and selective execution to measured detection and service outcomes. Paired comparisons identify format dependence, quantify expert corrections and evaluate escalation. Controlled service measurements locate a client-path improvement. Together, these results provide an empirical basis for choosing and evaluating gateway designs.</w:t>
+        <w:t xml:space="preserve">CyberSentinel demonstrates how to evaluate a URL gateway as a connected system: measure the information its features supply, the corrections its expert can make and the cost of execution. The experiments reveal a benchmark-format dependency, derive an exact routing constraint and verify a client-path improvement. These findings guide representation, expert and service design.</w:t>
       </w:r>
     </w:p>
     <w:p>
@@ -5415,7 +5377,7 @@
         </w:r>
       </w:hyperlink>
       <w:r>
-        <w:t xml:space="preserve"> evaluates those commitments and develops the diagnostic evidence needed to interpret their outcomes. </w:t>
+        <w:t xml:space="preserve"> reports their outcomes and uses controlled comparisons to explain them. </w:t>
       </w:r>
       <w:hyperlink w:anchor="revision_heading_4018" w:history="1">
         <w:r>
@@ -5423,7 +5385,7 @@
         </w:r>
       </w:hyperlink>
       <w:r>
-        <w:t xml:space="preserve"> preserves the working thesis and methodological record.</w:t>
+        <w:t xml:space="preserve"> retains the working thesis and methodological record.</w:t>
       </w:r>
     </w:p>
     <w:p>
@@ -5442,7 +5404,7 @@
         <w:ind w:firstLine="720"/>
       </w:pPr>
       <w:r>
-        <w:t xml:space="preserve">The objectives are to quantify representation value across sources, evaluate monitoring through its subsequent decisions, and measure the detection and execution consequences of selective expert use. Both classes are assessed at fixed operating points. </w:t>
+        <w:t xml:space="preserve">The objectives are to measure what structural and character representations add across sources, whether monitoring improves decisions, and how selective expert use affects detection and execution. Fixed operating points support comparisons in both classes. </w:t>
       </w:r>
       <w:hyperlink w:anchor="heading_62" w:history="1">
         <w:r>
@@ -5450,7 +5412,7 @@
         </w:r>
       </w:hyperlink>
       <w:r>
-        <w:t xml:space="preserve"> connects the results to gateway design priorities.</w:t>
+        <w:t xml:space="preserve"> develops the resulting design priorities.</w:t>
       </w:r>
     </w:p>
     <w:p>
@@ -5745,7 +5707,7 @@
         <w:ind w:firstLine="720"/>
       </w:pPr>
       <w:r>
-        <w:t>For RQ1, the study connects internal discrimination to URL-format dependence. Structural features add 64.07 percentage points of internal recall; validation controls reveal format–class association, and a fixed-weight scheme intervention measures external sensitivity. A separate refit achieves exact invariance across 8,622 pairs with a measured detection trade-off. These experiments develop the robustness questions of Ahamed et al. (2026), Rashid et al. (2024) and Tsai et al. (2024) without assigning an unmeasured share of the gain to HTTPS (</w:t>
+        <w:t xml:space="preserve">For RQ1, structural features add 64.07 percentage points of internal recall. Validation labels also follow a URL-format convention, and changing the scheme changes frozen-model external decisions. A separate refit removes sensitivity across 8,622 pairs and measures the detection trade-off. These tests assess representation stability alongside accuracy, extending the robustness questions of Ahamed et al. (2026), Rashid et al. (2024) and Tsai et al. (2024). They do not assign a fraction of the gain to HTTPS (</w:t>
       </w:r>
       <w:hyperlink w:anchor="heading_53" w:history="1">
         <w:r>
@@ -5761,7 +5723,7 @@
         </w:r>
       </w:hyperlink>
       <w:r>
-        <w:t>).</w:t>
+        <w:t xml:space="preserve">).</w:t>
       </w:r>
     </w:p>
     <w:p>
@@ -5769,15 +5731,7 @@
         <w:ind w:firstLine="720"/>
       </w:pPr>
       <w:r>
-        <w:t xml:space="preserve">For RQ2, the study follows distribution alerts into detection decisions. The GMM recognizes 87.12% of external windows; escalation adds 218 certified false positives without another gold detection. The comparison establishes why response utility must accompany sensitivity. Paired routing analysis identifies the expert corrections available to that response, applying the downstream-error reasoning of </w:t>
-      </w:r>
-      <w:proofErr w:type="spellStart"/>
-      <w:r>
-        <w:t>Jitkrittum</w:t>
-      </w:r>
-      <w:proofErr w:type="spellEnd"/>
-      <w:r>
-        <w:t xml:space="preserve"> et al. (2023) to this gateway (</w:t>
+        <w:t xml:space="preserve">For RQ2, the study follows monitoring alerts into decisions. The GMM recognizes 87.12% of external windows; escalation adds 218 certified false positives without another gold detection. Recognizing unfamiliar inputs and improving their classification require separate tests. Paired routing analysis counts available expert corrections, applying the downstream-error reasoning of Jitkrittum et al. (2023) to this gateway (</w:t>
       </w:r>
       <w:hyperlink w:anchor="heading_54" w:history="1">
         <w:r>
@@ -5793,7 +5747,7 @@
         </w:r>
       </w:hyperlink>
       <w:r>
-        <w:t>).</w:t>
+        <w:t xml:space="preserve">).</w:t>
       </w:r>
     </w:p>
     <w:p>
@@ -5801,19 +5755,7 @@
         <w:ind w:firstLine="720"/>
       </w:pPr>
       <w:r>
-        <w:t xml:space="preserve">For RQ3, paired decisions quantify expert </w:t>
-      </w:r>
-      <w:proofErr w:type="gramStart"/>
-      <w:r>
-        <w:t>value</w:t>
-      </w:r>
-      <w:proofErr w:type="gramEnd"/>
-      <w:r>
-        <w:t xml:space="preserve"> and separate measurements locate execution cost. The models' common false positives establish a 90.5487% floor for routing between unchanged decisions. Supporting service experiments demonstrate faster </w:t>
-      </w:r>
-      <w:r>
-        <w:lastRenderedPageBreak/>
-        <w:t>worker-owned clients on synthetic structural-only HTTP requests, corroborated by a no-model control. Comparable predictions agree despite changed admission order; expert scoring cost is measured separately. Building on established cascades (Li et al., 2021), the study connects selective execution to detection and service behavior.</w:t>
+        <w:t xml:space="preserve">For RQ3, shared false positives set an exact 90.5487% floor on routing between unchanged decisions. Separately, worker-owned clients improve synthetic structural-only HTTP latency; a no-model control supports the client-path explanation. Comparable predictions agree while admission order changes. Expert scoring cost is measured on its own workload. Building on established cascades (Li et al., 2021), these experiments evaluate both selective execution and service design.</w:t>
       </w:r>
     </w:p>
     <w:p>
@@ -5973,7 +5915,7 @@
         <w:ind w:firstLine="720"/>
       </w:pPr>
       <w:r>
-        <w:t>This focused, nonsystematic review develops the questions behind the evaluation. Which URL signals are available, and which transfer across sources? When do expert calls or monitoring decisions help, and what do they cost? Collection conventions, correlated errors and execution overhead connect these questions.</w:t>
+        <w:t xml:space="preserve">This focused, nonsystematic review explains CyberSentinel's design choices. URL detection determines what evidence the gateway uses; transfer research asks whether it survives a change of source. Cascades and monitoring inform when to spend computation and how to judge the resulting decisions. Service measurement examines the caller's experience.</w:t>
       </w:r>
     </w:p>
     <w:p>
@@ -6487,7 +6429,7 @@
         <w:ind w:firstLine="720"/>
       </w:pPr>
       <w:r>
-        <w:t xml:space="preserve">The study connects URL-detector design to detection and execution through three questions: representation value across sources, monitoring-guided escalation, and selective expert execution. Paired outcomes and controlled interventions explain the results and identify design targets. </w:t>
+        <w:t xml:space="preserve">CyberSentinel connects three engineering choices: URL representation, monitoring-guided expert selection and service implementation. Paired outcomes and controlled interventions measure how each choice affects the gateway. </w:t>
       </w:r>
       <w:hyperlink w:anchor="table_1" w:history="1">
         <w:r>
@@ -6498,7 +6440,7 @@
         </w:r>
       </w:hyperlink>
       <w:r>
-        <w:t xml:space="preserve"> relates this contribution to robustness, adaptation and deferral research.</w:t>
+        <w:t xml:space="preserve"> places this contribution within robustness, adaptation and deferral research.</w:t>
       </w:r>
     </w:p>
     <w:p>
@@ -7361,16 +7303,7 @@
         <w:ind w:firstLine="720"/>
       </w:pPr>
       <w:r>
-        <w:t xml:space="preserve">Structural-versus-length comparisons establish the internal baseline; validation controls and scheme interventions examine its format dependence. Ordered replay follows monitoring alerts into decisions. Paired outputs measure expert corrections and </w:t>
-      </w:r>
-      <w:proofErr w:type="gramStart"/>
-      <w:r>
-        <w:lastRenderedPageBreak/>
-        <w:t>introduced</w:t>
-      </w:r>
-      <w:proofErr w:type="gramEnd"/>
-      <w:r>
-        <w:t xml:space="preserve"> errors, while separate scoring and HTTP measurements locate execution cost. Each comparison informs a gateway design choice.</w:t>
+        <w:t xml:space="preserve">Structural-versus-length tests measure the feature gain; validation controls and scheme interventions examine its dependencies. Ordered replay follows alerts into decisions, while paired outputs count expert corrections and new errors. Separate scoring and HTTP tests locate execution costs. Each comparison informs what to change and how to judge it.</w:t>
       </w:r>
     </w:p>
     <w:p>
@@ -7528,7 +7461,7 @@
         <w:ind w:firstLine="720"/>
       </w:pPr>
       <w:r>
-        <w:t xml:space="preserve">The design pairs observations at the unit relevant to each research question. RQ1 compares decisions on identical uniform resource locators (URLs), with contrast-specific uncertainty in </w:t>
+        <w:t xml:space="preserve">Each research question is tested at the unit where its effect can be observed. RQ1 compares decisions on identical uniform resource locators (URLs), using the contrast-specific uncertainty in </w:t>
       </w:r>
       <w:hyperlink w:anchor="heading_32" w:history="1">
         <w:r>
@@ -7536,7 +7469,7 @@
         </w:r>
       </w:hyperlink>
       <w:r>
-        <w:t xml:space="preserve">. RQ2 follows complete 256-request windows at stride 64 into subsequent decisions. RQ3 measures complete Hypertext Transfer Protocol (HTTP) requests across a 125-cell matrix. Models, thresholds and decision rules remain fixed across its two sessions; </w:t>
+        <w:t xml:space="preserve">. RQ2 follows complete 256-request windows at stride 64 into subsequent decisions. RQ3 measures complete Hypertext Transfer Protocol (HTTP) requests across a 125-cell matrix. Models, thresholds and decision rules stay fixed across its two sessions; </w:t>
       </w:r>
       <w:hyperlink w:anchor="heading_51" w:history="1">
         <w:r>
@@ -7571,7 +7504,7 @@
         <w:ind w:firstLine="720"/>
       </w:pPr>
       <w:r>
-        <w:t xml:space="preserve">Preparation first determines which URLs are eligible and establishes their identities. Each eligible URL then supplies 25 structural features and a Logistic-L1 score. The uncertainty band determines whether this first-stage decision stands or the character transformer replaces it. The Gaussian mixture model (GMM) observes the features and first-stage score, but its alerts affect only future requests. Saved outcomes are joined to publisher-label strata afterward for evaluation. HTTP execution is measured separately, as shown in </w:t>
+        <w:t xml:space="preserve">Preparation determines which URLs are eligible and assigns their identities. Each URL supplies 25 structural features and a Logistic-L1 score. The uncertainty band decides whether to retain that decision or replace it with the character transformer's. The Gaussian mixture model (GMM) observes the features and first-stage score; its alerts affect only future requests. Publisher-label strata are joined to saved outcomes afterward for evaluation. HTTP execution is measured separately (</w:t>
       </w:r>
       <w:hyperlink w:anchor="figure_1" w:history="1">
         <w:r>
@@ -7593,7 +7526,7 @@
         </w:r>
       </w:hyperlink>
       <w:r>
-        <w:t>.</w:t>
+        <w:t xml:space="preserve">).</w:t>
       </w:r>
     </w:p>
     <w:p>
@@ -7601,7 +7534,7 @@
         <w:ind w:firstLine="720"/>
       </w:pPr>
       <w:r>
-        <w:t>The router does not receive the external outcome strata. Every record retained after mechanical quarantine enters the same ordered stream; gold, certified and secondary designations are applied only in the later analysis. The records also distinguish assignment to the transformer from an actual transformer execution. This distinction allows logical routing and physical computation to be measured separately.</w:t>
+        <w:t xml:space="preserve">The router processes every mechanically eligible record in the same ordered stream. It never receives the external outcome strata: gold, certified and secondary designations enter only the later analysis. Saved records distinguish a request assigned to the transformer from an actual transformer execution, allowing routing decisions and computation to be measured separately.</w:t>
       </w:r>
     </w:p>
     <w:p>
@@ -8852,7 +8785,7 @@
         <w:ind w:firstLine="720"/>
       </w:pPr>
       <w:r>
-        <w:t xml:space="preserve">Systems are compared on aligned records under frozen models and thresholds. </w:t>
+        <w:t xml:space="preserve">Every system is compared on the same aligned records with models and thresholds held fixed. </w:t>
       </w:r>
       <w:hyperlink w:anchor="heading_51" w:history="1">
         <w:r>
@@ -8868,7 +8801,7 @@
         </w:r>
       </w:hyperlink>
       <w:r>
-        <w:t xml:space="preserve"> document the recovery and information exposure qualifying those comparisons.</w:t>
+        <w:t xml:space="preserve"> document the recovery procedures and prior information exposure that affect interpretation.</w:t>
       </w:r>
     </w:p>
     <w:p>
@@ -9112,7 +9045,7 @@
         <w:ind w:firstLine="720"/>
       </w:pPr>
       <w:r>
-        <w:t xml:space="preserve">H2 requires more than recognition of external windows. </w:t>
+        <w:t xml:space="preserve">RQ2 evaluates the response as well as the alert. Alongside external-window recognition, </w:t>
       </w:r>
       <w:hyperlink w:anchor="heading_9" w:history="1">
         <w:r>
@@ -9120,15 +9053,7 @@
         </w:r>
       </w:hyperlink>
       <w:r>
-        <w:t xml:space="preserve"> also specifies the validation-audit false-alert limit, certified-negative policy FPR and positive paired recall improvement. The original 2,000-replicate domain bootstrap describes saved outcomes conditional </w:t>
-      </w:r>
-      <w:proofErr w:type="gramStart"/>
-      <w:r>
-        <w:t>on stream</w:t>
-      </w:r>
-      <w:proofErr w:type="gramEnd"/>
-      <w:r>
-        <w:t xml:space="preserve"> order. </w:t>
+        <w:t xml:space="preserve"> requires a validation-audit false-alert limit, certified-negative policy FPR and positive paired recall improvement. The original 2,000-replicate domain bootstrap describes saved outcomes conditional on stream order; </w:t>
       </w:r>
       <w:hyperlink w:anchor="heading_32" w:history="1">
         <w:r>
@@ -9136,7 +9061,7 @@
         </w:r>
       </w:hyperlink>
       <w:r>
-        <w:t xml:space="preserve"> corrects the uncertainty claims it cannot support. The comparison evaluates the decisions following an alert, without attributing a causal effect solely to the monitor signal.</w:t>
+        <w:t xml:space="preserve"> corrects the uncertainty claims it cannot support. Following each alert into subsequent decisions measures the response without assigning its causal effect solely to the monitor signal.</w:t>
       </w:r>
     </w:p>
     <w:p>
@@ -9244,7 +9169,7 @@
         <w:ind w:firstLine="720"/>
       </w:pPr>
       <w:r>
-        <w:t xml:space="preserve">The evidence supports examination from input to outcome. </w:t>
+        <w:t xml:space="preserve">The record lets a reader trace a result from input to outcome. </w:t>
       </w:r>
       <w:hyperlink w:anchor="heading_73" w:history="1">
         <w:r>
@@ -9252,7 +9177,7 @@
         </w:r>
       </w:hyperlink>
       <w:r>
-        <w:t xml:space="preserve"> links each result to its population, fitted state and evaluation procedure, and independent calculations check saved counts, paired decisions and latency. Every declared diagnostic fit and all outcomes are retained. </w:t>
+        <w:t xml:space="preserve"> links each finding to its population, fitted model and evaluation procedure. Separate calculations check saved counts, paired decisions and latency. Every declared diagnostic fit and its outcomes are retained. </w:t>
       </w:r>
       <w:hyperlink w:anchor="revision_heading_4018" w:history="1">
         <w:r>
@@ -9260,7 +9185,7 @@
         </w:r>
       </w:hyperlink>
       <w:r>
-        <w:t xml:space="preserve"> documents information exposure and execution history so the comparisons can be interpreted and reused accurately.</w:t>
+        <w:t xml:space="preserve"> records information exposure and execution history so others can interpret and reuse the comparisons.</w:t>
       </w:r>
     </w:p>
     <w:p>
@@ -10052,13 +9977,16 @@
       <w:pPr>
         <w:ind w:firstLine="720"/>
       </w:pPr>
+      <w:r>
+        <w:t xml:space="preserve">The evaluation measures CyberSentinel's component contributions and investigates their mechanisms. </w:t>
+      </w:r>
       <w:hyperlink w:anchor="heading_46" w:history="1">
         <w:r>
           <w:t>Sections 4.1</w:t>
         </w:r>
       </w:hyperlink>
       <w:r>
-        <w:t>–</w:t>
+        <w:t xml:space="preserve">–</w:t>
       </w:r>
       <w:hyperlink w:anchor="heading_52" w:history="1">
         <w:r>
@@ -10066,7 +9994,7 @@
         </w:r>
       </w:hyperlink>
       <w:r>
-        <w:t xml:space="preserve"> answer RQ1–RQ3 through representation, monitoring and service measurements and adjudicate H1–H3. </w:t>
+        <w:t xml:space="preserve"> answer RQ1–RQ3 through representation, monitoring and service tests and adjudicate H1–H3. </w:t>
       </w:r>
       <w:hyperlink w:anchor="heading_53" w:history="1">
         <w:r>
@@ -10074,7 +10002,7 @@
         </w:r>
       </w:hyperlink>
       <w:r>
-        <w:t>–</w:t>
+        <w:t xml:space="preserve">–</w:t>
       </w:r>
       <w:hyperlink w:anchor="revision_heading_4009" w:history="1">
         <w:r>
@@ -10082,7 +10010,7 @@
         </w:r>
       </w:hyperlink>
       <w:r>
-        <w:t xml:space="preserve"> explain the outcomes using scheme interventions, expert correction analysis, client controls and shuffled-label diagnostics. Each comparison connects an implemented design choice to its measured consequences.</w:t>
+        <w:t xml:space="preserve"> examine scheme sensitivity, expert corrections, client costs and shuffled-label ranking, connecting the findings to design decisions.</w:t>
       </w:r>
     </w:p>
     <w:p>
@@ -10122,7 +10050,7 @@
         <w:ind w:firstLine="720"/>
       </w:pPr>
       <w:r>
-        <w:t xml:space="preserve">Saved confusion counts, paired outcomes and request records support independent arithmetic reconstruction. </w:t>
+        <w:t xml:space="preserve">Saved confusion counts, paired outcomes and request records allow the arithmetic to be checked independently. </w:t>
       </w:r>
       <w:hyperlink w:anchor="heading_51" w:history="1">
         <w:r>
@@ -10138,7 +10066,7 @@
         </w:r>
       </w:hyperlink>
       <w:r>
-        <w:t xml:space="preserve"> preserves its execution identities and verification record.</w:t>
+        <w:t xml:space="preserve"> retains execution identities and the verification record.</w:t>
       </w:r>
     </w:p>
     <w:p>
@@ -14094,7 +14022,7 @@
         <w:ind w:firstLine="720"/>
       </w:pPr>
       <w:r>
-        <w:t xml:space="preserve">Structural features deliver a substantial recall gain: 64.0723 percentage points internally and 76.8116 on gold positives relative to length-only (</w:t>
+        <w:t xml:space="preserve">Structural features produce a substantial recall gain over length alone: 64.0723 percentage points internally and 76.8116 on gold positives (</w:t>
       </w:r>
       <w:hyperlink w:anchor="table_6" w:history="1">
         <w:r>
@@ -14102,7 +14030,7 @@
         </w:r>
       </w:hyperlink>
       <w:r>
-        <w:t xml:space="preserve">). The domain-clustered and corrected independent-pair intervals exclude zero under their respective assumptions. Internal structural FPR stays below 1%. External evaluation identifies the associated specificity cost: certified FPR is 90.5487%, compared with 9.4513% for length-only. The paired comparison quantifies the external specificity cost of the recall gain. Because source composition and representation both change, this comparison alone cannot separate their effects. </w:t>
+        <w:t xml:space="preserve">). The domain-clustered and corrected independent-pair intervals exclude zero under their respective assumptions. Internal structural FPR stays below 1%. On certified external negatives, FPR is 90.5487%, compared with 9.4513% for length-only. Measuring both classes shows the specificity cost alongside the additional detections. This comparison spans changes in source composition and representation, so it cannot separate their effects. </w:t>
       </w:r>
       <w:hyperlink w:anchor="heading_50" w:history="1">
         <w:r>
@@ -15294,7 +15222,7 @@
         <w:ind w:firstLine="720"/>
       </w:pPr>
       <w:r>
-        <w:t xml:space="preserve">RQ1 establishes the measured representation gain within the benchmark and identifies the properties that govern its transfer. Format–class association and the fixed-weight scheme test connect discrimination to supplied URL spelling; the different partitions do not quantify the share of recall gain caused by HTTPS. The zero-call cascade reproduces structural-only recall. Paired errors and scheme interventions therefore direct design toward transferable discrimination and useful expert corrections. The joint H1 decision incorporates external specificity and incremental cascade benefit.</w:t>
+        <w:t xml:space="preserve">RQ1 measures what the richer representation adds and opens a second question: which signals support that gain? Validation format–class association and the fixed-weight scheme test show dependence on supplied URL spelling. The different partitions do not quantify the HTTPS-attributable share of the recall gain. The zero-call cascade reproduces structural-only recall, making expert corrections a separate design question. H1 evaluates both external specificity and incremental cascade benefit.</w:t>
       </w:r>
     </w:p>
     <w:p>
@@ -16226,7 +16154,7 @@
         <w:ind w:firstLine="720"/>
       </w:pPr>
       <w:r>
-        <w:t>Following monitoring alerts through subsequent decisions measures the value of the resulting action. The policy routes 8,253/8,701 external requests to the transformer, or 94.8512%, compared with none for the fixed band. Both detect 69/69 gold positives; certified false positives rise from 2,261 to 2,479, adding 218 errors or 8.7305 percentage points. These paired outcomes identify expert selection as a distinct design requirement from detecting input change. They describe the ordered replay; its stateful, nonrandomized design and degenerate historical bootstrap do not establish a population or randomized causal effect.</w:t>
+        <w:t xml:space="preserve">Following an alert into the next decisions reveals what escalation contributes. The policy sends 8,253/8,701 external requests to the transformer, or 94.8512%, compared with none for the fixed band. Both detect 69/69 gold positives. Certified false positives rise from 2,261 to 2,479: an additional 218 errors, or 8.7305 percentage points. Recognizing input change therefore needs a separate test of the expert selected to respond. These results describe ordered replay; its stateful, nonrandomized design and degenerate historical bootstrap do not establish a population or randomized causal effect.</w:t>
       </w:r>
     </w:p>
     <w:p>
@@ -16773,7 +16701,7 @@
         <w:ind w:firstLine="720"/>
       </w:pPr>
       <w:r>
-        <w:t xml:space="preserve">The monitor comparison separates sensitivity to input change from the quality of the resulting action. External-window sensitivity, audit false alerts, policy FPR and recall improvement give distinct evidence about the monitor and the action it triggers. MMD and PSI flag every external window with fewer audit alerts, making them informative monitoring comparators. Action utility still requires paired decision evidence. The supplement retains all 396 external monitor-window records and 3,432 PSI feature scores.</w:t>
+        <w:t xml:space="preserve">The comparison makes monitoring and response two measurable parts of the design. External-window sensitivity and audit false alerts describe the monitor; policy FPR and recall improvement describe the action it triggers. MMD and PSI flag every external window with fewer audit alerts, making them informative monitoring comparators. Whether an alert leads to a better decision still requires paired outcomes. The supplement retains all 396 external monitor-window records and 3,432 PSI feature scores.</w:t>
       </w:r>
     </w:p>
     <w:p>
@@ -16797,7 +16725,7 @@
         <w:ind w:firstLine="720"/>
       </w:pPr>
       <w:r>
-        <w:t>The service evaluation measures what the caller experiences across the complete HTTP request path, including costs outside isolated model scoring.</w:t>
+        <w:t xml:space="preserve">The HTTP tests measure the caller's full wait across the request path, exposing costs beyond isolated model scoring.</w:t>
       </w:r>
     </w:p>
     <w:p>
@@ -16817,7 +16745,7 @@
         <w:ind w:firstLine="720"/>
       </w:pPr>
       <w:r>
-        <w:t xml:space="preserve">The operational groups appear in </w:t>
+        <w:t xml:space="preserve">The fixed gate meets the expert-invocation and primary request-error limits. Its designated invocation cell records zero physical transformer attempts across 10,000 measured requests, within the ≤ 30% limit and consistent with zero fixed-band selections. Primary cells 21–25 record 0/50,000 errors, satisfying &lt; 0.1%, while pooled p95 across 50,000 terminal latencies is 364.3004101 ms against the 200 ms requirement. These measurements separate computation saved from time spent serving a request. </w:t>
       </w:r>
       <w:hyperlink w:anchor="table_9" w:history="1">
         <w:r>
@@ -16825,7 +16753,7 @@
         </w:r>
       </w:hyperlink>
       <w:r>
-        <w:t xml:space="preserve">, with throughput and post-phase drain separated in </w:t>
+        <w:t xml:space="preserve"> reports the operational groups; </w:t>
       </w:r>
       <w:hyperlink w:anchor="table_10" w:history="1">
         <w:r>
@@ -16833,7 +16761,7 @@
         </w:r>
       </w:hyperlink>
       <w:r>
-        <w:t xml:space="preserve">. The designated invocation cell records zero physical transformer attempts across 10,000 measured requests, meeting the ≤ 30% limit and agreeing with the zero fixed-band selection count. This quantifies the expert computation saved by the selected gate; external detection is evaluated alongside that saving. For primary cells 21–25, pooled p95 across 50,000 terminal latencies is 364.3004101 ms, above the 200 ms requirement. The error count is 0/50,000, satisfying &lt; 0.1%. Together, these observations distinguish invocation, latency and request reliability.</w:t>
+        <w:t xml:space="preserve"> separates throughput from post-phase drain. External detection is assessed alongside these service results.</w:t>
       </w:r>
     </w:p>
     <w:p>
@@ -24567,7 +24495,7 @@
         <w:ind w:firstLine="720"/>
       </w:pPr>
       <w:r>
-        <w:t xml:space="preserve">Joint detection and service measurements show what the low invocation rate delivers. Both the cascade and transformer exceed the certified FPR limit, flag all 1,163 label-free Tranco controls and detect the same 69 gold positives. Under independent-pair assumptions, the corrected 95% recall-difference envelope is [−6.1533, 6.1533] percentage points. It is too wide to establish the −2-point margin, but does not demonstrate inferiority. RQ3 establishes low transformer use and primary request reliability while locating the specificity, recall-uncertainty and latency constraints. H3 satisfies two of its eight gates; the remaining six specify the conditions for qualifying the complete gateway.</w:t>
+        <w:t xml:space="preserve">The joint measurements show why invocation, detection and latency need their own tests. The cascade and transformer exceed the certified FPR limit, flag all 1,163 label-free Tranco controls and detect the same 69 gold positives. Under independent-pair assumptions, the corrected 95% recall-difference envelope is [−6.1533, 6.1533] percentage points. It leaves the −2-point margin unresolved and does not demonstrate inferiority. RQ3 measures low transformer use and primary request reliability, while specifying the constraints on specificity, recall uncertainty and latency. H3 satisfies two of its eight gates; the remaining six define what the complete gateway must additionally demonstrate.</w:t>
       </w:r>
     </w:p>
     <w:p>
@@ -32647,7 +32575,7 @@
                 <w:sz w:val="20"/>
                 <w:szCs w:val="20"/>
               </w:rPr>
-              <w:t>fail</w:t>
+              <w:t>not met</w:t>
             </w:r>
           </w:p>
         </w:tc>
@@ -32787,7 +32715,7 @@
                 <w:sz w:val="20"/>
                 <w:szCs w:val="20"/>
               </w:rPr>
-              <w:t>fail</w:t>
+              <w:t>not met</w:t>
             </w:r>
           </w:p>
         </w:tc>
@@ -32927,7 +32855,7 @@
                 <w:sz w:val="20"/>
                 <w:szCs w:val="20"/>
               </w:rPr>
-              <w:t>fail</w:t>
+              <w:t>not met</w:t>
             </w:r>
           </w:p>
         </w:tc>
@@ -33207,7 +33135,7 @@
                 <w:sz w:val="20"/>
                 <w:szCs w:val="20"/>
               </w:rPr>
-              <w:t>fail</w:t>
+              <w:t>not met</w:t>
             </w:r>
           </w:p>
         </w:tc>
@@ -33487,7 +33415,7 @@
                 <w:sz w:val="20"/>
                 <w:szCs w:val="20"/>
               </w:rPr>
-              <w:t>fail</w:t>
+              <w:t>not met</w:t>
             </w:r>
           </w:p>
         </w:tc>
@@ -33767,7 +33695,7 @@
                 <w:sz w:val="20"/>
                 <w:szCs w:val="20"/>
               </w:rPr>
-              <w:t>fail</w:t>
+              <w:t>not met</w:t>
             </w:r>
           </w:p>
         </w:tc>
@@ -33907,7 +33835,7 @@
                 <w:sz w:val="20"/>
                 <w:szCs w:val="20"/>
               </w:rPr>
-              <w:t>fail</w:t>
+              <w:t>not met</w:t>
             </w:r>
           </w:p>
         </w:tc>
@@ -34048,7 +33976,7 @@
                 <w:sz w:val="20"/>
                 <w:szCs w:val="20"/>
               </w:rPr>
-              <w:t>fail</w:t>
+              <w:t>not met</w:t>
             </w:r>
           </w:p>
         </w:tc>
@@ -34188,7 +34116,7 @@
                 <w:sz w:val="20"/>
                 <w:szCs w:val="20"/>
               </w:rPr>
-              <w:t>fail</w:t>
+              <w:t>not met</w:t>
             </w:r>
           </w:p>
         </w:tc>
@@ -34328,7 +34256,7 @@
                 <w:sz w:val="20"/>
                 <w:szCs w:val="20"/>
               </w:rPr>
-              <w:t>fail</w:t>
+              <w:t>not met</w:t>
             </w:r>
           </w:p>
         </w:tc>
@@ -34477,7 +34405,7 @@
                 <w:sz w:val="20"/>
                 <w:szCs w:val="20"/>
               </w:rPr>
-              <w:t>fail</w:t>
+              <w:t>not met</w:t>
             </w:r>
           </w:p>
         </w:tc>
@@ -34626,7 +34554,7 @@
                 <w:sz w:val="20"/>
                 <w:szCs w:val="20"/>
               </w:rPr>
-              <w:t>fail</w:t>
+              <w:t>not met</w:t>
             </w:r>
           </w:p>
         </w:tc>
@@ -34766,7 +34694,7 @@
                 <w:sz w:val="20"/>
                 <w:szCs w:val="20"/>
               </w:rPr>
-              <w:t>fail</w:t>
+              <w:t>not met</w:t>
             </w:r>
           </w:p>
         </w:tc>
@@ -35074,7 +35002,7 @@
                 <w:sz w:val="20"/>
                 <w:szCs w:val="20"/>
               </w:rPr>
-              <w:t>fail</w:t>
+              <w:t>not met</w:t>
             </w:r>
           </w:p>
         </w:tc>
@@ -35262,7 +35190,7 @@
         <w:ind w:firstLine="720"/>
       </w:pPr>
       <w:r>
-        <w:t>The diagnostic comparisons make the results actionable. Changing scheme spelling under fixed weights tests representation sensitivity. Error overlap determines the best outcome available from selecting between fixed model decisions. A no-model control locates request latency that persists without classifier work. Each comparison connects an observed behavior to a distinct intervention and a measurable consequence.</w:t>
+        <w:t xml:space="preserve">Each diagnostic tests an explanation for observed behavior. Changing scheme spelling with weights fixed tests input sensitivity. Paired model errors establish available expert corrections. Removing model work from the HTTP control probes delay elsewhere in the request path. These comparisons identify changes to implement and evaluate.</w:t>
       </w:r>
     </w:p>
     <w:p>
@@ -35270,31 +35198,7 @@
         <w:ind w:firstLine="720"/>
       </w:pPr>
       <w:r>
-        <w:t xml:space="preserve">All evaluated internal negatives have </w:t>
-      </w:r>
-      <w:proofErr w:type="spellStart"/>
-      <w:r>
-        <w:t>is_https</w:t>
-      </w:r>
-      <w:proofErr w:type="spellEnd"/>
-      <w:r>
-        <w:t xml:space="preserve">=1 and zero path length; external gold-positive inputs have </w:t>
-      </w:r>
-      <w:proofErr w:type="spellStart"/>
-      <w:r>
-        <w:t>is_https</w:t>
-      </w:r>
-      <w:proofErr w:type="spellEnd"/>
-      <w:r>
-        <w:t xml:space="preserve">=0. These subset summaries do not describe every training row or live transport; external inputs use publisher </w:t>
-      </w:r>
-      <w:proofErr w:type="spellStart"/>
-      <w:r>
-        <w:t>url_norm</w:t>
-      </w:r>
-      <w:proofErr w:type="spellEnd"/>
-      <w:r>
-        <w:t xml:space="preserve">. </w:t>
+        <w:t xml:space="preserve">The supplied URL format provides a concrete clue. All evaluated internal negatives have is_https=1 and zero path length; external gold-positive inputs have is_https=0. These summaries concern the stated subsets and publisher url_norm, not every training row or live transport. Validation format–class association in </w:t>
       </w:r>
       <w:hyperlink w:anchor="revision_heading_4016" w:history="1">
         <w:r>
@@ -35302,7 +35206,7 @@
         </w:r>
       </w:hyperlink>
       <w:r>
-        <w:t xml:space="preserve"> measures validation format–class association. This connects internal separability to the frozen-model test in </w:t>
+        <w:t xml:space="preserve"> complements the fixed-weight test in </w:t>
       </w:r>
       <w:hyperlink w:anchor="revision_heading_4010" w:history="1">
         <w:r>
@@ -35310,15 +35214,7 @@
         </w:r>
       </w:hyperlink>
       <w:r>
-        <w:t xml:space="preserve">. Because a prefix affects </w:t>
-      </w:r>
-      <w:proofErr w:type="spellStart"/>
-      <w:r>
-        <w:t>is_https</w:t>
-      </w:r>
-      <w:proofErr w:type="spellEnd"/>
-      <w:r>
-        <w:t xml:space="preserve"> and string-composition predictors, neutralization must cover several pathways. Collection-source causality remains unidentified. The no-model control separately motivates testing client organization with the scorer fixed.</w:t>
+        <w:t xml:space="preserve">. A prefix changes several predictors, including is_https and string composition, so removing scheme dependence requires more than dropping one indicator. The evidence does not identify how collection practices produced the association. Separately, the no-model control motivates changing client organization while keeping the scorer fixed.</w:t>
       </w:r>
     </w:p>
     <w:p>
@@ -35326,7 +35222,7 @@
         <w:ind w:firstLine="720"/>
       </w:pPr>
       <w:r>
-        <w:t>Paired error analysis yields an exact routing bound for the evaluated models. Both falsely flag the same 2,261 of 2,497 certified negatives. The transformer repairs none of those errors, adds 218 false positives and shares only 18 correct negatives with the structural model. Even a router selecting the correct decision whenever either model supplies one must retain every shared false positive: its FPR is at least 2,261/2,497, or 90.5487%. This cohort-specific bound directs redesign toward changed thresholds, new evidence or retraining before gate selection alone can improve specificity. Each would create different available decisions and require evaluation.</w:t>
+        <w:t xml:space="preserve">The paired decisions give an exact limit on what routing can do. Both models falsely flag the same 2,261 of 2,497 certified negatives. The transformer repairs none of those errors, adds 218 false positives and shares only 18 correct negatives with the structural model. Even a router that chooses correctly whenever either model does must retain every shared false positive. Its FPR floor is 2,261/2,497, or 90.5487%. For these fixed decisions, improving the gate cannot lower that floor. Changed thresholds, additional evidence or retraining would create different decisions and require a new evaluation.</w:t>
       </w:r>
     </w:p>
     <w:p>
@@ -35343,7 +35239,7 @@
         <w:ind w:firstLine="720"/>
       </w:pPr>
       <w:r>
-        <w:t>The fixed cascade's inactivity follows directly from calibration: the selected width is zero and evaluation contains no ties (</w:t>
+        <w:t xml:space="preserve">The fixed cascade's inactivity follows from calibration: its width is zero, and evaluation contains no ties (</w:t>
       </w:r>
       <w:hyperlink w:anchor="heading_47" w:history="1">
         <w:r>
@@ -35351,7 +35247,7 @@
         </w:r>
       </w:hyperlink>
       <w:r>
-        <w:t>). Replaying 43,294 saved feature vectors, routing memberships and decisions reproduces the accepted outputs. This establishes a basis for examining wider gates while retaining the original rule and its recorded decisions.</w:t>
+        <w:t xml:space="preserve">). Replaying 43,294 saved feature vectors, routing memberships and decisions reproduces the accepted outputs. With that behavior verified, wider gates can be examined against the original rule and its recorded decisions.</w:t>
       </w:r>
     </w:p>
     <w:p>
@@ -36369,7 +36265,7 @@
         <w:ind w:firstLine="720"/>
       </w:pPr>
       <w:r>
-        <w:t xml:space="preserve">The labeled comparison quantifies the detection trade-off of scheme neutralization. At the two frozen operating points in </w:t>
+        <w:t xml:space="preserve">The refit removes an input dependency and quantifies its detection trade-off. At the two frozen operating points in </w:t>
       </w:r>
       <w:hyperlink w:anchor="table_19" w:history="1">
         <w:r>
@@ -36380,7 +36276,7 @@
         </w:r>
       </w:hyperlink>
       <w:r>
-        <w:t xml:space="preserve">, the refitted candidate produces 251 fewer false positives and 184 fewer true positives. These paired counts distinguish beneficial false-alert reductions from suppressed detections, giving the invariance result its operational meaning.</w:t>
+        <w:t xml:space="preserve">, it produces 251 fewer false positives and 184 fewer true positives. Paired labels make both consequences of the invariance repair explicit.</w:t>
       </w:r>
     </w:p>
     <w:p>
@@ -37498,7 +37394,7 @@
         <w:ind w:firstLine="720"/>
       </w:pPr>
       <w:r>
-        <w:t>The representation meets its invariance requirement across the tested population. All 8,622 candidate feature vectors and scores exactly match their opposite-scheme companions, with no decision changes (</w:t>
+        <w:t xml:space="preserve">The refitted representation removes scheme sensitivity exactly across the tested population. All 8,622 candidate feature vectors and scores match their opposite-scheme companions, with no decision changes (</w:t>
       </w:r>
       <w:hyperlink w:anchor="table_20" w:history="1">
         <w:r>
@@ -37506,7 +37402,7 @@
         </w:r>
       </w:hyperlink>
       <w:r>
-        <w:t>). The comparator has 2,909 exact score matches, 481 decision flips and a maximum absolute score change of 0.99665. A flip establishes sensitivity, not necessarily an error. The companions do not add independent outcome labels.</w:t>
+        <w:t xml:space="preserve">). The comparator has 2,909 exact score matches, 481 decision flips and a maximum absolute score change of 0.99665. A flip shows sensitivity; whether it is an error requires a label. The companions add no independent outcome labels.</w:t>
       </w:r>
     </w:p>
     <w:p>
@@ -38088,7 +37984,7 @@
         <w:ind w:firstLine="720"/>
       </w:pPr>
       <w:r>
-        <w:t xml:space="preserve">D establishes exact scheme invariance and measures the accompanying detection trade-off. Normalization, refitting and recalibration reduce both false positives and true-positive detections, with FPR remaining above the required ceiling. The engineering finding is that representation stability and class separation are distinct properties, each requiring labeled evaluation when the detector is redesigned. The joint requirement evaluates both properties together.</w:t>
+        <w:t xml:space="preserve">D verifies scheme invariance. The combined normalization, refitting and recalibration also reduce both false positives and true-positive detections, with FPR above the ceiling. Stability and class separation are distinct properties; the joint requirement tests both.</w:t>
       </w:r>
     </w:p>
     <w:p>
@@ -38167,7 +38063,7 @@
         <w:ind w:firstLine="720"/>
       </w:pPr>
       <w:r>
-        <w:t>Changing client ownership reduces p95 in every primary pair (</w:t>
+        <w:t xml:space="preserve">Giving each worker its own client reduces p95 in every primary pair (</w:t>
       </w:r>
       <w:hyperlink w:anchor="table_21" w:history="1">
         <w:r>
@@ -38178,7 +38074,7 @@
         </w:r>
       </w:hyperlink>
       <w:r>
-        <w:t>). The median worker/shared run ratio is 0.203249, a 79.68% median paired reduction. Its two-sided 97.5% interval, from 10,000 fixed run-pair resamples, is [0.187903, 0.213508]. This estimates the effect in the tested synthetic structural-only HTTP setup; every pair and resample has a defined result.</w:t>
+        <w:t xml:space="preserve">). The median worker/shared run ratio is 0.203249, a 79.68% median paired reduction. Across 10,000 fixed run-pair resamples, the two-sided 97.5% interval is [0.187903, 0.213508]. Every pair and resample has a defined result. The estimate describes this synthetic structural-only HTTP setup.</w:t>
       </w:r>
     </w:p>
     <w:p>
@@ -38186,35 +38082,7 @@
         <w:ind w:firstLine="720"/>
       </w:pPr>
       <w:r>
-        <w:t xml:space="preserve">The control locates the improvement outside changes to the classifier. Pooled </w:t>
-      </w:r>
-      <w:proofErr w:type="gramStart"/>
-      <w:r>
-        <w:t>successful-request</w:t>
-      </w:r>
-      <w:proofErr w:type="gramEnd"/>
-      <w:r>
-        <w:t xml:space="preserve"> p95 falls from 358.3663 to 71.9990 </w:t>
-      </w:r>
-      <w:proofErr w:type="spellStart"/>
-      <w:r>
-        <w:t>ms</w:t>
-      </w:r>
-      <w:proofErr w:type="spellEnd"/>
-      <w:r>
-        <w:t xml:space="preserve"> for structural scoring and from 345.95 to 67.21 </w:t>
-      </w:r>
-      <w:proofErr w:type="spellStart"/>
-      <w:r>
-        <w:t>ms</w:t>
-      </w:r>
-      <w:proofErr w:type="spellEnd"/>
-      <w:r>
-        <w:t xml:space="preserve"> with no model. The similar reduction supports a client/transport explanation, although it does not identify a particular queue or scheduling cost. Worker </w:t>
-      </w:r>
-      <w:r>
-        <w:lastRenderedPageBreak/>
-        <w:t xml:space="preserve">p95 meets the 200-ms requirement in this setup. These pooled request quantiles and the median paired run ratio are different summaries. </w:t>
+        <w:t xml:space="preserve">The no-model control helps explain where the time was saved. Pooled successful-request p95 drops from 358.3663 to 71.9990 ms with structural scoring and from 345.95 to 67.21 ms with no model. Both improvements point to the client/transport path, without isolating a particular queue or scheduling cost. Worker p95 meets the 200-ms requirement in this setup. Pooled request quantiles and the median paired run ratio summarize different quantities; </w:t>
       </w:r>
       <w:hyperlink w:anchor="heading_60" w:history="1">
         <w:r>
@@ -38222,7 +38090,7 @@
         </w:r>
       </w:hyperlink>
       <w:r>
-        <w:t xml:space="preserve"> reports all control and response comparisons.</w:t>
+        <w:t xml:space="preserve"> reports the full control and response comparisons.</w:t>
       </w:r>
     </w:p>
     <w:p>
@@ -41718,7 +41586,7 @@
         <w:ind w:firstLine="720"/>
       </w:pPr>
       <w:r>
-        <w:t xml:space="preserve">S achieves four of its five requirements (</w:t>
+        <w:t xml:space="preserve">S meets four of its five requirements (</w:t>
       </w:r>
       <w:hyperlink w:anchor="table_23" w:history="1">
         <w:r>
@@ -41729,7 +41597,7 @@
         </w:r>
       </w:hyperlink>
       <w:r>
-        <w:t xml:space="preserve">): the latency, reliability and comparable-prediction results establish a useful client-path improvement. The fifth requirement concerns admission-sequence equality, which is not preserved. The thresholds and required response fields retain their prespecified definitions.</w:t>
+        <w:t xml:space="preserve">), demonstrating lower latency and reliable worker requests. Comparable predictions also agree. Admission-sequence equality, the fifth requirement, is not preserved. Each threshold and required response field keeps its prespecified definition.</w:t>
       </w:r>
     </w:p>
     <w:p>
@@ -42329,7 +42197,7 @@
         <w:ind w:firstLine="720"/>
       </w:pPr>
       <w:r>
-        <w:t xml:space="preserve">S demonstrates a substantial client-path optimization: every comparable prediction is preserved, and worker latency and reliability meet their requirements. The response comparison also makes the design choice explicit. Applications requiring identical admission order need an additional ordering mechanism and evaluation to satisfy the full response contract. The measured benefit applies to the single-host, synthetic, structural-only closed-loop workload. It is separate from H3 and from transformer-service acceleration.</w:t>
+        <w:t xml:space="preserve">Worker-owned clients improve latency and reliability in this experiment, preserving every comparable prediction. Applications requiring identical admission order need a separately evaluated ordering mechanism. The single-host, synthetic, structural-only closed-loop result is separate from H3 and does not measure transformer-service acceleration.</w:t>
       </w:r>
     </w:p>
     <w:p>
@@ -42353,11 +42221,7 @@
         <w:ind w:firstLine="720"/>
       </w:pPr>
       <w:r>
-        <w:t xml:space="preserve">The mechanism tests turn representation, routing and cost measurements into design evidence. Frozen-weight scheme changes isolate spelling sensitivity. Domain-balanced routing identifies selected repairs and harms, and invocation counters quantify </w:t>
-      </w:r>
-      <w:r>
-        <w:lastRenderedPageBreak/>
-        <w:t>the work performed by the expert. Audited shuffled-label controls explain how substantial ranking can arise after training labels are randomized.</w:t>
+        <w:t xml:space="preserve">These tests examine decision changes and computation. Frozen-weight scheme changes isolate spelling sensitivity. The domain-balanced cohort measures revised gates' repairs and new errors, while invocation counters record actual work. Audited shuffled-label fits explain strong validation ranking after training-label randomization.</w:t>
       </w:r>
     </w:p>
     <w:p>
@@ -42376,7 +42240,7 @@
         <w:ind w:firstLine="720"/>
       </w:pPr>
       <w:r>
-        <w:t xml:space="preserve">A prefix change has a substantial effect even with the structural model held fixed (</w:t>
+        <w:t xml:space="preserve">Changing the prefix changes decisions even when the structural model is held fixed (</w:t>
       </w:r>
       <w:hyperlink w:anchor="revision_table_4011" w:history="1">
         <w:r>
@@ -42387,7 +42251,7 @@
         </w:r>
       </w:hyperlink>
       <w:r>
-        <w:t xml:space="preserve">). HTTP detects all 69 gold positives but flags every certified negative. With Hypertext Transfer Protocol Secure (HTTPS), certified false positives fall from 2,261 to 50, while gold detections fall from 69 to 22. The change removes 2,211 false positives at the cost of 47 true-positive detections. FPR remains 2.0024%, above 1%, and recall declines to 31.8841%. The intervention quantifies the detection cost of prefix replacement and establishes the need to evaluate normalization against both classes.</w:t>
+        <w:t xml:space="preserve">). HTTP detects all 69 gold positives and flags every certified negative. With Hypertext Transfer Protocol Secure (HTTPS), certified false positives drop from 2,261 to 50 and gold detections from 69 to 22. The change removes 2,211 false positives and 47 true-positive detections. FPR is 2.0024%, above 1%, and recall is 31.8841%. The paired intervention demonstrates scheme dependence and measures its cost in both classes. It also shows why normalization needs a labeled detection test.</w:t>
       </w:r>
     </w:p>
     <w:p>
@@ -43031,15 +42895,7 @@
         <w:ind w:firstLine="720"/>
       </w:pPr>
       <w:r>
-        <w:t xml:space="preserve">HTTPS also reduces secondary-positive detections from 4,972 to 687 and label-free </w:t>
-      </w:r>
-      <w:proofErr w:type="spellStart"/>
-      <w:r>
-        <w:t>Tranco</w:t>
-      </w:r>
-      <w:proofErr w:type="spellEnd"/>
-      <w:r>
-        <w:t xml:space="preserve"> alerts from 1,163 to 63. F establishes scheme dependence under fixed weights and threshold; validation format–class association supplies related evidence about internal separability. D instead refits and recalibrates on the original development partitions, then evaluates another cohort. Its invariance and detection trade-off cannot be pooled with F or attributed to normalization alone.</w:t>
+        <w:t xml:space="preserve">HTTPS reduces secondary-positive detections from 4,972 to 687 and label-free Tranco alerts from 1,163 to 63. F demonstrates scheme dependence with weights and threshold fixed; the validation association gives related evidence about internal separability. D asks a different question by refitting and recalibrating on the original development partitions before evaluating another cohort. Its invariance and detection effects cannot be pooled with F or attributed to normalization alone.</w:t>
       </w:r>
     </w:p>
     <w:p>
@@ -44541,19 +44397,7 @@
         <w:ind w:firstLine="720"/>
       </w:pPr>
       <w:r>
-        <w:t xml:space="preserve">The recall comparison is precise but operates at a ceiling. Original and symmetric cascades each share 1,392 detections with transformer-only and have no positive discordances. Their conservative two-sided 95% envelope is [−0.3143, 0.3143] </w:t>
-      </w:r>
-      <w:r>
-        <w:lastRenderedPageBreak/>
-        <w:t xml:space="preserve">percentage points, above the −2-point lower-margin requirement under independent labeled-pair assumptions. Newcombe method 10 gives [−0.2752, 0.2752]. This supports recall-only noninferiority at these operating points; it does not demonstrate expert utility when specificity remains poor. The positives occupy 56 source-event-date groups, the largest containing 362. Resampling all-zero differences </w:t>
-      </w:r>
-      <w:proofErr w:type="gramStart"/>
-      <w:r>
-        <w:t>gives</w:t>
-      </w:r>
-      <w:proofErr w:type="gramEnd"/>
-      <w:r>
-        <w:t xml:space="preserve"> descriptive [0,0] and cannot establish campaign independence or replace the nondegenerate interval.</w:t>
+        <w:t xml:space="preserve">The recall comparison supports preservation of positive detections at these operating points. Original and symmetric cascades share 1,392 detections with transformer-only, with no positive discordances. Under independent labeled-pair assumptions, their conservative two-sided 95% envelope is [−0.3143, 0.3143] percentage points, above the −2-point lower-margin requirement. Newcombe method 10 gives [−0.2752, 0.2752]. This is recall-only noninferiority at a detection ceiling; the false-positive counts and selected corrections determine expert utility. The positives occupy 56 source-event-date groups, the largest containing 362. Resampling all-zero differences gives descriptive [0,0], which cannot establish campaign independence or replace the nondegenerate interval.</w:t>
       </w:r>
     </w:p>
     <w:p>
@@ -44561,7 +44405,7 @@
         <w:ind w:firstLine="720"/>
       </w:pPr>
       <w:r>
-        <w:t xml:space="preserve">The selected calls reveal the distinction between limiting expert use and selecting useful corrections. Symmetric routing makes 21/2,654 calls, or 0.7913%, and directional routing 18/2,654, or 0.6782%, both below 30%. Across all available transformer decisions, one would repair a structural false positive and 194 would introduce one. Both gates select zero repairs, preserve recall and exceed 1% FPR. Structural ROC AUC/AP are 0.7549/0.7485; transformer values are 0.7062/0.6909. These rankings describe the near-balanced cohort. Useful selection is assessed through paired decisions; the cohort mixture is not a deployment-prevalence estimate.</w:t>
+        <w:t xml:space="preserve">Routing quality depends on the corrections selected as well as how often the expert is called. Symmetric routing makes 21/2,654 calls, or 0.7913%, and directional routing 18/2,654, or 0.6782%, both below 30%. Among all transformer decisions, one would repair a structural false positive and 194 would introduce one. Both gates select zero repairs, preserve recall and exceed 1% FPR. Structural ROC AUC/AP are 0.7549/0.7485; transformer values are 0.7062/0.6909. These rankings describe the near-balanced cohort. The paired decisions judge selection, while the cohort mixture supplies no estimate of deployment prevalence.</w:t>
       </w:r>
     </w:p>
     <w:p>
@@ -47182,7 +47026,7 @@
         <w:ind w:firstLine="720"/>
       </w:pPr>
       <w:r>
-        <w:t>The controls explain how small random coefficients rank structured validation labels despite near-constant probabilities. Component removal, randomization and convergence checks support the mechanism; correlated features also contribute. Format–class association and the external scheme intervention converge on a representation dependency. The 32,695-row validation and 34,593-row group-test analyses do not identify the HTTPS-attributable fraction of the 64.07-point gain. Collection-source causality, historical-fit authentication and certification against every leakage path remain outside these checks; threshold-selected performance requires separate evaluation.</w:t>
+        <w:t xml:space="preserve">The controls explain why small random coefficients can rank validation labels well while producing probabilities close to a constant. Removing a score term, repeating randomization and tightening convergence give complementary tests of that explanation; correlated features also contribute. The internal format association and external scheme intervention both expose representation dependence. The 32,695-row validation and 34,593-row group-test analyses do not quantify the HTTPS-attributable fraction of the 64.07-point gain. These checks also do not identify collection-source causality, authenticate historical fits or certify the absence of every leakage path. Threshold-selected performance requires separate evaluation.</w:t>
       </w:r>
     </w:p>
     <w:p>
@@ -47224,7 +47068,7 @@
         <w:ind w:firstLine="720"/>
       </w:pPr>
       <w:r>
-        <w:t xml:space="preserve">The study answers Research Questions 1–3 (RQ1–RQ3) with an empirical account of representation value, expert selection and execution cost. Paired interventions identify which system property changes, what benefit it delivers and what trade-off accompanies it. </w:t>
+        <w:t xml:space="preserve">CyberSentinel answers Research Questions 1–3 (RQ1–RQ3) through an implemented gateway and controlled experiments. The structural model supplies a substantial internal recall gain; subsequent comparisons investigate its dependencies, available expert corrections and service improvements. </w:t>
       </w:r>
       <w:hyperlink w:anchor="table_17" w:history="1">
         <w:r>
@@ -47235,7 +47079,7 @@
         </w:r>
       </w:hyperlink>
       <w:r>
-        <w:t xml:space="preserve"> reports the hypothesis decisions; the findings below explain their implications for design.</w:t>
+        <w:t xml:space="preserve"> gives the hypothesis decisions. The answers below develop their implications for design.</w:t>
       </w:r>
     </w:p>
     <w:p>
@@ -47243,7 +47087,7 @@
         <w:ind w:firstLine="720"/>
       </w:pPr>
       <w:r>
-        <w:t xml:space="preserve">RQ1—Representation and transfer. Structural features add 64.07 percentage points of internal recall over length alone, with a 95% domain-clustered interval [59.99, 67.63], at false-positive rate (FPR) 0.7747%. Format–class association qualifies transfer without quantifying the HTTPS-attributable share. External certified FPR is 90.5487%, versus 9.4513% for length-only; the cascade adds no recall or expert calls. These paired measurements distinguish internal representation value from transferable specificity and incremental expert benefit (</w:t>
+        <w:t xml:space="preserve">RQ1—Representation and transfer. Structural features add 64.07 percentage points of internal recall over length alone, with a 95% domain-clustered interval [59.99, 67.63], at false-positive rate (FPR) 0.7747%. Validation labels also follow a format convention whose share of the gain is unquantified. External certified FPR is 90.5487%, versus 9.4513% for length-only; the cascade adds no recall or expert calls (</w:t>
       </w:r>
       <w:hyperlink w:anchor="table_4_2_summary" w:history="1">
         <w:r>
@@ -47259,7 +47103,7 @@
         </w:r>
       </w:hyperlink>
       <w:r>
-        <w:t xml:space="preserve">).</w:t>
+        <w:t xml:space="preserve">). This finding motivates checking the signals behind a feature gain and measuring specificity on the intended source.</w:t>
       </w:r>
     </w:p>
     <w:p>
@@ -47267,7 +47111,7 @@
         <w:ind w:firstLine="720"/>
       </w:pPr>
       <w:r>
-        <w:t xml:space="preserve">Paired outcomes quantify the scope for expert correction: common false positives persist under selection between unchanged decisions. Representation tests establish a second design target. Supplied scheme changes frozen-model decisions; a refit achieves exact invariance while reducing both true and false positives. These distinct interventions require their own labeled evaluation; the refit's detection effect cannot be assigned to normalization alone.</w:t>
+        <w:t xml:space="preserve">The interventions make that test concrete. Scheme spelling changes frozen-model decisions. A separate refit removes scheme sensitivity while reducing true and false positives; its combined fitting and calibration changes require their own labeled evaluation. Paired outputs establish which errors an expert can correct. Shared errors survive every selection between those unchanged decisions.</w:t>
       </w:r>
     </w:p>
     <w:p>
@@ -47275,7 +47119,7 @@
         <w:ind w:firstLine="720"/>
       </w:pPr>
       <w:r>
-        <w:t xml:space="preserve">RQ2—Monitoring and action. The GMM flags 115/132 external windows (87.12%) against an 80% target and 28/252 audit windows (11.11%) against 5%. Ordered, stateful replay selects the expert for 8,253/8,701 requests (94.8512%); the resulting policy adds 218 certified false positives and retains 69/69 gold detections. Following alerts into paired decisions establishes a concrete evaluation method for response utility alongside input-departure recognition (</w:t>
+        <w:t xml:space="preserve">RQ2—Monitoring and action. The GMM recognizes 115/132 external windows (87.12%), exceeding its 80% target. Its audit alerts are 28/252 windows (11.11%) against 5%, so sensitivity and false alerts must be assessed together. Ordered, stateful replay sends 8,253/8,701 requests (94.8512%) to the expert. The policy retains 69/69 gold detections and adds 218 certified false positives (</w:t>
       </w:r>
       <w:hyperlink w:anchor="table_8" w:history="1">
         <w:r>
@@ -47283,7 +47127,7 @@
         </w:r>
       </w:hyperlink>
       <w:r>
-        <w:t xml:space="preserve">).</w:t>
+        <w:t xml:space="preserve">). Recognizing a change in inputs does not tell a gateway which response will help. Following alerts into paired decisions supplies that test.</w:t>
       </w:r>
     </w:p>
     <w:p>
@@ -47291,7 +47135,7 @@
         <w:ind w:firstLine="720"/>
       </w:pPr>
       <w:r>
-        <w:t xml:space="preserve">RQ3—Inline tradeoffs. The joint evaluation separates the costs of expert execution and request handling from detection quality. The fixed cascade meets its invocation and primary request-error limits; pooled p95 is 364.30 ms against a 200 ms budget, and external false-alert safeguards are exceeded. For the original 69-pair recall sample, the corrected lower bound is −6.1533 percentage points under independent labeled-pair assumptions. Its position below the −2-point margin leaves noninferiority unresolved, rather than establishing inferiority. These measurements identify the constraints governing inline operation (</w:t>
+        <w:t xml:space="preserve">RQ3—Inline tradeoffs. The fixed cascade meets the invocation and primary request-error limits. Pooled p95 is 364.30 ms against a 200 ms budget, and external false-alert safeguards are exceeded. The original 69-pair recall sample gives a corrected lower bound of −6.1533 percentage points under independent labeled-pair assumptions. That bound leaves the −2-point noninferiority margin unresolved; it does not establish inferiority (</w:t>
       </w:r>
       <w:hyperlink w:anchor="table_9" w:history="1">
         <w:r>
@@ -47315,7 +47159,7 @@
         </w:r>
       </w:hyperlink>
       <w:r>
-        <w:t xml:space="preserve">) and motivate the controlled comparisons of expert work and request handling.</w:t>
+        <w:t xml:space="preserve">). Measuring these quantities separately reveals where to intervene: detector computation and request handling need distinct experiments, alongside detection quality.</w:t>
       </w:r>
     </w:p>
     <w:p>
@@ -47323,7 +47167,7 @@
         <w:ind w:firstLine="720"/>
       </w:pPr>
       <w:r>
-        <w:t>The results identify three design priorities: evaluate representation stability with labeled detection, choose escalation for useful corrections, and distinguish expert computation from request handling. Client ownership improves synthetic structural-only HTTP latency; transformer calls increase scoring cost on another workload. Each result supports a specific intervention.</w:t>
+        <w:t xml:space="preserve">Worker-owned clients improve the synthetic structural-only service; separate scoring tests quantify transformer cost. These experiments connect a proposed change to a measurable consequence. Representation stability is tested with labeled detection, expert selection with corrections, and monitoring with the decisions its alerts change.</w:t>
       </w:r>
     </w:p>
     <w:p>
@@ -47347,7 +47191,7 @@
         <w:ind w:firstLine="720"/>
       </w:pPr>
       <w:r>
-        <w:t>The representation evidence identifies a concrete dependency. All 20,209 validation negatives use HTTPS, versus 46.6362% of positives; the negative HTTPS indicator has AUC 0.7668. The fixed-weight external intervention also changes decisions. This qualifies the internal gain without quantifying its HTTPS-attributable fraction. Paired error analysis establishes the decisions available to expert selection (</w:t>
+        <w:t xml:space="preserve">The benchmark investigation gives URL researchers a concrete check. All 20,209 validation negatives use HTTPS, versus 46.6362% of positives; the negative HTTPS indicator reaches AUC 0.7668. The fixed-weight external intervention also changes decisions. These findings justify checking format conventions before interpreting a gain as transferable detection, without quantifying the HTTPS-attributable fraction. Paired errors establish available expert corrections (</w:t>
       </w:r>
       <w:hyperlink w:anchor="heading_54" w:history="1">
         <w:r>
@@ -47363,7 +47207,7 @@
         </w:r>
       </w:hyperlink>
       <w:r>
-        <w:t>).</w:t>
+        <w:t xml:space="preserve">).</w:t>
       </w:r>
     </w:p>
     <w:p>
@@ -47379,7 +47223,7 @@
         </w:r>
       </w:hyperlink>
       <w:r>
-        <w:t xml:space="preserve"> isolates scheme sensitivity under fixed weights. </w:t>
+        <w:t xml:space="preserve"> tests spelling changes with weights fixed. </w:t>
       </w:r>
       <w:hyperlink w:anchor="table_19" w:history="1">
         <w:r>
@@ -47401,7 +47245,7 @@
         </w:r>
       </w:hyperlink>
       <w:r>
-        <w:t xml:space="preserve"> verify exact invariance after refitting and quantify the changes in true and false positives. Different cohorts and fitting procedures prevent attribution of the refit's effect to normalization alone. Together with internal format association, these results justify testing scheme dependence in URL benchmarks without identifying collection-source causality.</w:t>
+        <w:t xml:space="preserve"> verify exact scheme invariance after refitting and quantify detection changes. Different cohorts and fitting procedures prevent attributing the refit's effect to normalization alone. Together, the internal association and external intervention support a practical benchmark check; collection-source causality remains unresolved.</w:t>
       </w:r>
     </w:p>
     <w:p>
@@ -47409,7 +47253,7 @@
         <w:ind w:firstLine="720"/>
       </w:pPr>
       <w:r>
-        <w:t>Monitoring escalation adds 218 false positives without another gold detection. Paired outputs explain the constraint: 2,261 common false positives among 2,497 negatives impose a 90.5487% floor on unchanged-decision selection. On the separate cohort, one repair is available, but wider gates select none and add 18 false positives. Supporting service measurements identify a client-path improvement (</w:t>
+        <w:t xml:space="preserve">Routing provides an exact design constraint: 2,261 shared false positives among 2,497 certified negatives impose a 90.5487% floor on unchanged-decision selection. Escalation adds 218 false positives without another gold detection. On the separate cohort, one expert repair is available, but wider gates select none and add 18 false positives. Count available corrections before tuning a gate. Service tests identify a client-path improvement with matching comparable predictions despite changed admission order (</w:t>
       </w:r>
       <w:hyperlink w:anchor="table_21" w:history="1">
         <w:r>
@@ -47420,7 +47264,7 @@
         </w:r>
       </w:hyperlink>
       <w:r>
-        <w:t>–</w:t>
+        <w:t xml:space="preserve">–</w:t>
       </w:r>
       <w:hyperlink w:anchor="table_22" w:history="1">
         <w:r>
@@ -47431,7 +47275,7 @@
         </w:r>
       </w:hyperlink>
       <w:r>
-        <w:t xml:space="preserve">); </w:t>
+        <w:t xml:space="preserve">). </w:t>
       </w:r>
       <w:hyperlink w:anchor="revision_table_4015" w:history="1">
         <w:r>
@@ -47442,7 +47286,7 @@
         </w:r>
       </w:hyperlink>
       <w:r>
-        <w:t xml:space="preserve"> measures expert cost. Comparable predictions agree despite changed admission order.</w:t>
+        <w:t xml:space="preserve"> measures expert cost separately.</w:t>
       </w:r>
     </w:p>
     <w:p>
@@ -47450,31 +47294,7 @@
         <w:ind w:firstLine="720"/>
       </w:pPr>
       <w:r>
-        <w:t xml:space="preserve">These contributions develop established research questions through concrete gateway experiments. </w:t>
-      </w:r>
-      <w:proofErr w:type="spellStart"/>
-      <w:r>
-        <w:t>Jitkrittum</w:t>
-      </w:r>
-      <w:proofErr w:type="spellEnd"/>
-      <w:r>
-        <w:t xml:space="preserve"> et al. (2023) motivate examining downstream errors; this study measures available corrections, selected repairs and introduced errors. Ahamed et al. (2026) examine external specificity and class-specific transformations; the present experiments connect internal format association, a fixed-weight scheme effect and a separately verified invariance property. Monitoring replay then measures the outcome of changing routing. </w:t>
-      </w:r>
-      <w:proofErr w:type="spellStart"/>
-      <w:r>
-        <w:t>ExpertFusion's</w:t>
-      </w:r>
-      <w:proofErr w:type="spellEnd"/>
-      <w:r>
-        <w:t xml:space="preserve"> documented calibrated fusion and target-prior adaptation provide architectural context (</w:t>
-      </w:r>
-      <w:proofErr w:type="spellStart"/>
-      <w:r>
-        <w:t>aI</w:t>
-      </w:r>
-      <w:proofErr w:type="spellEnd"/>
-      <w:r>
-        <w:t>-area, 2026; Hussain et al., 2027), within the documented comparison rather than a claim of full-paper coverage or superiority.</w:t>
+        <w:t xml:space="preserve">These experiments make established research questions concrete for a URL gateway. Jitkrittum et al. (2023) motivate examining downstream errors; CyberSentinel counts available corrections, selected repairs and introduced errors. Ahamed et al. (2026) examine external specificity and class-specific transformations; this study connects an internal format association to a fixed-weight scheme effect and a verified invariance property. Monitoring replay follows a change in routing into its outcomes. ExpertFusion's documented calibrated fusion and target-prior adaptation provide architectural context (aI-area, 2026; Hussain et al., 2027). The comparison covers that documented architecture, without claiming full-paper coverage or superiority.</w:t>
       </w:r>
     </w:p>
     <w:p>
@@ -47482,7 +47302,7 @@
         <w:ind w:firstLine="720"/>
       </w:pPr>
       <w:r>
-        <w:t xml:space="preserve">The paired analysis establishes recall-only noninferiority conditional on independent labeled pairs. Pairing that interval with specificity and selected corrections makes its engineering meaning explicit: every model detects every positive while flagging most negatives, the original gate calls no expert, and the wider gate adds false positives. The interval precisely addresses recall preservation, while the paired decision counts establish the observed incremental utility. Shared observations provide neither independent replication nor a guarantee of campaign independence.</w:t>
+        <w:t xml:space="preserve">The recall-only analysis supports noninferiority conditional on independent labeled pairs. Every model detects every positive while flagging most negatives; the original gate calls no expert, and the wider gate adds false positives. Specificity and selected corrections therefore determine the practical value of the preserved recall. Reused observations provide neither independent replication nor guaranteed campaign independence.</w:t>
       </w:r>
     </w:p>
     <w:p>
@@ -47509,7 +47329,7 @@
         </w:r>
       </w:hyperlink>
       <w:r>
-        <w:t xml:space="preserve"> connects the findings to redesign decisions and the evidence supporting each one.</w:t>
+        <w:t xml:space="preserve"> connects each measured finding to a decision a gateway designer can make.</w:t>
       </w:r>
     </w:p>
     <w:p>
@@ -48483,16 +48303,13 @@
       <w:pPr>
         <w:ind w:firstLine="720"/>
       </w:pPr>
-      <w:r>
-        <w:t xml:space="preserve">The reusable evidence connects inputs, fitted states, outcomes and diagnostics in </w:t>
-      </w:r>
       <w:hyperlink w:anchor="heading_73" w:history="1">
         <w:r>
           <w:t>Appendix A</w:t>
         </w:r>
       </w:hyperlink>
       <w:r>
-        <w:t xml:space="preserve">. Consumed-input checks, reconstructed scores, permutation results and convergence sensitivity provide complementary support for the ranking explanation. </w:t>
+        <w:t xml:space="preserve"> connects inputs, fitted states, outcomes and diagnostics. Input audits, reconstructed scores, permutations and convergence checks support the ranking explanation. </w:t>
       </w:r>
       <w:hyperlink w:anchor="revision_heading_4018" w:history="1">
         <w:r>
@@ -48500,7 +48317,7 @@
         </w:r>
       </w:hyperlink>
       <w:r>
-        <w:t xml:space="preserve"> documents information exposure and execution history. The resulting record supports reproducible analysis of these fits; historical-fit authentication and independent replication remain separate questions.</w:t>
+        <w:t xml:space="preserve"> records information exposure and execution history. This record makes the analyzed fits reproducible; historical-fit authentication and independent replication remain separate requirements.</w:t>
       </w:r>
     </w:p>
     <w:p>
@@ -48508,11 +48325,7 @@
         <w:ind w:firstLine="720"/>
       </w:pPr>
       <w:r>
-        <w:t xml:space="preserve">The shuffled-label analysis contributes a tested explanation of a misleading control outcome. Small residual coefficients can produce substantial ranking on validation data where format is associated with class, even when probabilities are nearly constant. Input auditing verifies the fitted data, term removal measures one component's </w:t>
-      </w:r>
-      <w:r>
-        <w:lastRenderedPageBreak/>
-        <w:t>effect, repeated randomization reproduces the spread, and stricter optimization preserves it. These complementary checks establish a practical method for examining controls through fitted state and score ordering as well as the score mean.</w:t>
+        <w:t xml:space="preserve">The shuffled-label investigation explains a puzzling control result. Small residual coefficients can rank format-associated labels well despite nearly constant probabilities. Input audits check the fitted data, term removal measures one contribution, randomization reproduces the spread, and stricter optimization preserves it. Inspecting coefficients and score ordering alongside mean probability provides a practical test of such controls.</w:t>
       </w:r>
     </w:p>
     <w:p>
@@ -48539,7 +48352,7 @@
         </w:r>
       </w:hyperlink>
       <w:r>
-        <w:t xml:space="preserve"> connects achieved component findings to the complete gateway decision. Internal feature gains, the exact routing bound, verified scheme invariance and the measured client-path improvement each support a specific engineering choice. The joint H1–H3 decisions in the table determine system-level qualification; the component findings establish the design evidence developed by this research. The contribution is an empirical design basis: the experiments identify which properties to change, quantify their consequences, and specify how to evaluate the resulting gateway.</w:t>
+        <w:t xml:space="preserve"> connects component findings, complete gateway decisions and engineering insight. The internal feature gain, routing bound, scheme invariance and client-path improvement each answer a design question. Joint H1–H3 decisions determine system-level qualification. The contribution is a measured basis for redesign: what to change, why it matters and how to test its consequences.</w:t>
       </w:r>
     </w:p>
     <w:p>
@@ -48570,9 +48383,10 @@
         <w:tblLook w:val="04A0" w:firstRow="1" w:lastRow="0" w:firstColumn="1" w:lastColumn="0" w:noHBand="0" w:noVBand="1"/>
       </w:tblPr>
       <w:tblGrid>
-        <w:gridCol w:w="2160"/>
-        <w:gridCol w:w="3600"/>
+        <w:gridCol w:w="1440"/>
+        <w:gridCol w:w="2640"/>
         <w:gridCol w:w="2880"/>
+        <w:gridCol w:w="1680"/>
       </w:tblGrid>
       <w:tr>
         <w:trPr>
@@ -48581,7 +48395,7 @@
         </w:trPr>
         <w:tc>
           <w:tcPr>
-            <w:tcW w:w="2160" w:type="dxa"/>
+            <w:tcW w:w="1440" w:type="dxa"/>
             <w:shd w:val="clear" w:color="auto" w:fill="D9EAF2"/>
             <w:tcMar>
               <w:top w:w="60" w:type="dxa"/>
@@ -48612,7 +48426,7 @@
         </w:tc>
         <w:tc>
           <w:tcPr>
-            <w:tcW w:w="3600" w:type="dxa"/>
+            <w:tcW w:w="2640" w:type="dxa"/>
             <w:shd w:val="clear" w:color="auto" w:fill="D9EAF2"/>
             <w:tcMar>
               <w:top w:w="60" w:type="dxa"/>
@@ -48669,6 +48483,37 @@
                 <w:szCs w:val="20"/>
               </w:rPr>
               <w:t>Overall decision</w:t>
+            </w:r>
+          </w:p>
+        </w:tc>
+        <w:tc>
+          <w:tcPr>
+            <w:tcW w:w="1680" w:type="dxa"/>
+            <w:shd w:val="clear" w:color="auto" w:fill="D9EAF2"/>
+            <w:tcMar>
+              <w:top w:w="60" w:type="dxa"/>
+              <w:left w:w="80" w:type="dxa"/>
+              <w:bottom w:w="60" w:type="dxa"/>
+              <w:right w:w="80" w:type="dxa"/>
+            </w:tcMar>
+          </w:tcPr>
+          <w:p>
+            <w:pPr>
+              <w:keepNext/>
+              <w:spacing w:before="40" w:after="40"/>
+              <w:rPr>
+                <w:sz w:val="20"/>
+                <w:szCs w:val="20"/>
+              </w:rPr>
+            </w:pPr>
+            <w:r>
+              <w:rPr>
+                <w:b/>
+                <w:bCs/>
+                <w:sz w:val="20"/>
+                <w:szCs w:val="20"/>
+              </w:rPr>
+              <w:t xml:space="preserve">What it revealed</w:t>
             </w:r>
           </w:p>
         </w:tc>
@@ -48679,7 +48524,7 @@
         </w:trPr>
         <w:tc>
           <w:tcPr>
-            <w:tcW w:w="2160" w:type="dxa"/>
+            <w:tcW w:w="1440" w:type="dxa"/>
             <w:tcMar>
               <w:top w:w="60" w:type="dxa"/>
               <w:left w:w="80" w:type="dxa"/>
@@ -48707,7 +48552,7 @@
         </w:tc>
         <w:tc>
           <w:tcPr>
-            <w:tcW w:w="3600" w:type="dxa"/>
+            <w:tcW w:w="2640" w:type="dxa"/>
             <w:tcMar>
               <w:top w:w="60" w:type="dxa"/>
               <w:left w:w="80" w:type="dxa"/>
@@ -48758,6 +48603,34 @@
                 <w:szCs w:val="20"/>
               </w:rPr>
               <w:t>Not supported; external specificity and incremental cascade gain do not meet the joint criteria</w:t>
+            </w:r>
+          </w:p>
+        </w:tc>
+        <w:tc>
+          <w:tcPr>
+            <w:tcW w:w="1680" w:type="dxa"/>
+            <w:tcMar>
+              <w:top w:w="60" w:type="dxa"/>
+              <w:left w:w="80" w:type="dxa"/>
+              <w:bottom w:w="60" w:type="dxa"/>
+              <w:right w:w="80" w:type="dxa"/>
+            </w:tcMar>
+          </w:tcPr>
+          <w:p>
+            <w:pPr>
+              <w:keepNext/>
+              <w:spacing w:before="40" w:after="40"/>
+              <w:rPr>
+                <w:sz w:val="20"/>
+                <w:szCs w:val="20"/>
+              </w:rPr>
+            </w:pPr>
+            <w:r>
+              <w:rPr>
+                <w:sz w:val="20"/>
+                <w:szCs w:val="20"/>
+              </w:rPr>
+              <w:t xml:space="preserve">Check format dependence, specificity and available expert corrections.</w:t>
             </w:r>
           </w:p>
         </w:tc>
@@ -48768,7 +48641,7 @@
         </w:trPr>
         <w:tc>
           <w:tcPr>
-            <w:tcW w:w="2160" w:type="dxa"/>
+            <w:tcW w:w="1440" w:type="dxa"/>
             <w:tcMar>
               <w:top w:w="60" w:type="dxa"/>
               <w:left w:w="80" w:type="dxa"/>
@@ -48796,7 +48669,7 @@
         </w:tc>
         <w:tc>
           <w:tcPr>
-            <w:tcW w:w="3600" w:type="dxa"/>
+            <w:tcW w:w="2640" w:type="dxa"/>
             <w:tcMar>
               <w:top w:w="60" w:type="dxa"/>
               <w:left w:w="80" w:type="dxa"/>
@@ -48847,6 +48720,34 @@
                 <w:szCs w:val="20"/>
               </w:rPr>
               <w:t>Not supported; audit false alarms, policy specificity and incremental gold recall do not meet the joint criteria</w:t>
+            </w:r>
+          </w:p>
+        </w:tc>
+        <w:tc>
+          <w:tcPr>
+            <w:tcW w:w="1680" w:type="dxa"/>
+            <w:tcMar>
+              <w:top w:w="60" w:type="dxa"/>
+              <w:left w:w="80" w:type="dxa"/>
+              <w:bottom w:w="60" w:type="dxa"/>
+              <w:right w:w="80" w:type="dxa"/>
+            </w:tcMar>
+          </w:tcPr>
+          <w:p>
+            <w:pPr>
+              <w:keepNext/>
+              <w:spacing w:before="40" w:after="40"/>
+              <w:rPr>
+                <w:sz w:val="20"/>
+                <w:szCs w:val="20"/>
+              </w:rPr>
+            </w:pPr>
+            <w:r>
+              <w:rPr>
+                <w:sz w:val="20"/>
+                <w:szCs w:val="20"/>
+              </w:rPr>
+              <w:t xml:space="preserve">Test escalation outcomes separately from alert sensitivity and false alerts.</w:t>
             </w:r>
           </w:p>
         </w:tc>
@@ -48857,7 +48758,7 @@
         </w:trPr>
         <w:tc>
           <w:tcPr>
-            <w:tcW w:w="2160" w:type="dxa"/>
+            <w:tcW w:w="1440" w:type="dxa"/>
             <w:tcMar>
               <w:top w:w="60" w:type="dxa"/>
               <w:left w:w="80" w:type="dxa"/>
@@ -48885,7 +48786,7 @@
         </w:tc>
         <w:tc>
           <w:tcPr>
-            <w:tcW w:w="3600" w:type="dxa"/>
+            <w:tcW w:w="2640" w:type="dxa"/>
             <w:tcMar>
               <w:top w:w="60" w:type="dxa"/>
               <w:left w:w="80" w:type="dxa"/>
@@ -48936,6 +48837,34 @@
                 <w:szCs w:val="20"/>
               </w:rPr>
               <w:t>Not supported; external risk and pooled p95 requirements are not met, and the two-point recall margin is not established</w:t>
+            </w:r>
+          </w:p>
+        </w:tc>
+        <w:tc>
+          <w:tcPr>
+            <w:tcW w:w="1680" w:type="dxa"/>
+            <w:tcMar>
+              <w:top w:w="60" w:type="dxa"/>
+              <w:left w:w="80" w:type="dxa"/>
+              <w:bottom w:w="60" w:type="dxa"/>
+              <w:right w:w="80" w:type="dxa"/>
+            </w:tcMar>
+          </w:tcPr>
+          <w:p>
+            <w:pPr>
+              <w:keepNext/>
+              <w:spacing w:before="40" w:after="40"/>
+              <w:rPr>
+                <w:sz w:val="20"/>
+                <w:szCs w:val="20"/>
+              </w:rPr>
+            </w:pPr>
+            <w:r>
+              <w:rPr>
+                <w:sz w:val="20"/>
+                <w:szCs w:val="20"/>
+              </w:rPr>
+              <w:t xml:space="preserve">Evaluate detection, recall uncertainty, expert work and HTTP cost together.</w:t>
             </w:r>
           </w:p>
         </w:tc>
@@ -48946,7 +48875,7 @@
         </w:trPr>
         <w:tc>
           <w:tcPr>
-            <w:tcW w:w="2160" w:type="dxa"/>
+            <w:tcW w:w="1440" w:type="dxa"/>
             <w:tcMar>
               <w:top w:w="60" w:type="dxa"/>
               <w:left w:w="80" w:type="dxa"/>
@@ -48974,7 +48903,7 @@
         </w:tc>
         <w:tc>
           <w:tcPr>
-            <w:tcW w:w="3600" w:type="dxa"/>
+            <w:tcW w:w="2640" w:type="dxa"/>
             <w:tcMar>
               <w:top w:w="60" w:type="dxa"/>
               <w:left w:w="80" w:type="dxa"/>
@@ -49025,6 +48954,34 @@
                 <w:szCs w:val="20"/>
               </w:rPr>
               <w:t>Not supported; recall-gain and low-FPR requirements are not met</w:t>
+            </w:r>
+          </w:p>
+        </w:tc>
+        <w:tc>
+          <w:tcPr>
+            <w:tcW w:w="1680" w:type="dxa"/>
+            <w:tcMar>
+              <w:top w:w="60" w:type="dxa"/>
+              <w:left w:w="80" w:type="dxa"/>
+              <w:bottom w:w="60" w:type="dxa"/>
+              <w:right w:w="80" w:type="dxa"/>
+            </w:tcMar>
+          </w:tcPr>
+          <w:p>
+            <w:pPr>
+              <w:keepNext/>
+              <w:spacing w:before="40" w:after="40"/>
+              <w:rPr>
+                <w:sz w:val="20"/>
+                <w:szCs w:val="20"/>
+              </w:rPr>
+            </w:pPr>
+            <w:r>
+              <w:rPr>
+                <w:sz w:val="20"/>
+                <w:szCs w:val="20"/>
+              </w:rPr>
+              <w:t xml:space="preserve">Verify scheme stability and labeled detection after refitting.</w:t>
             </w:r>
           </w:p>
         </w:tc>
@@ -49035,7 +48992,7 @@
         </w:trPr>
         <w:tc>
           <w:tcPr>
-            <w:tcW w:w="2160" w:type="dxa"/>
+            <w:tcW w:w="1440" w:type="dxa"/>
             <w:tcMar>
               <w:top w:w="60" w:type="dxa"/>
               <w:left w:w="80" w:type="dxa"/>
@@ -49062,7 +49019,7 @@
         </w:tc>
         <w:tc>
           <w:tcPr>
-            <w:tcW w:w="3600" w:type="dxa"/>
+            <w:tcW w:w="2640" w:type="dxa"/>
             <w:tcMar>
               <w:top w:w="60" w:type="dxa"/>
               <w:left w:w="80" w:type="dxa"/>
@@ -49143,6 +49100,33 @@
                 <w:szCs w:val="20"/>
               </w:rPr>
               <w:t>Not supported as a conjunction; strict agreement is 799/100,000. All 99,999 comparable predictions agree</w:t>
+            </w:r>
+          </w:p>
+        </w:tc>
+        <w:tc>
+          <w:tcPr>
+            <w:tcW w:w="1680" w:type="dxa"/>
+            <w:tcMar>
+              <w:top w:w="60" w:type="dxa"/>
+              <w:left w:w="80" w:type="dxa"/>
+              <w:bottom w:w="60" w:type="dxa"/>
+              <w:right w:w="80" w:type="dxa"/>
+            </w:tcMar>
+          </w:tcPr>
+          <w:p>
+            <w:pPr>
+              <w:spacing w:before="40" w:after="40"/>
+              <w:rPr>
+                <w:sz w:val="20"/>
+                <w:szCs w:val="20"/>
+              </w:rPr>
+            </w:pPr>
+            <w:r>
+              <w:rPr>
+                <w:sz w:val="20"/>
+                <w:szCs w:val="20"/>
+              </w:rPr>
+              <w:t xml:space="preserve">Client ownership improves service; admission order requires a separate contract.</w:t>
             </w:r>
           </w:p>
         </w:tc>
@@ -49153,7 +49137,7 @@
         </w:trPr>
         <w:tc>
           <w:tcPr>
-            <w:tcW w:w="2160" w:type="dxa"/>
+            <w:tcW w:w="1440" w:type="dxa"/>
             <w:tcMar>
               <w:top w:w="60" w:type="dxa"/>
               <w:left w:w="80" w:type="dxa"/>
@@ -49181,7 +49165,7 @@
         </w:tc>
         <w:tc>
           <w:tcPr>
-            <w:tcW w:w="3600" w:type="dxa"/>
+            <w:tcW w:w="2640" w:type="dxa"/>
             <w:tcMar>
               <w:top w:w="60" w:type="dxa"/>
               <w:left w:w="80" w:type="dxa"/>
@@ -49230,6 +49214,33 @@
                 <w:szCs w:val="20"/>
               </w:rPr>
               <w:t>Both supported conditional on independent labeled pairs; not original H3 or deployment adequacy</w:t>
+            </w:r>
+          </w:p>
+        </w:tc>
+        <w:tc>
+          <w:tcPr>
+            <w:tcW w:w="1680" w:type="dxa"/>
+            <w:tcMar>
+              <w:top w:w="60" w:type="dxa"/>
+              <w:left w:w="80" w:type="dxa"/>
+              <w:bottom w:w="60" w:type="dxa"/>
+              <w:right w:w="80" w:type="dxa"/>
+            </w:tcMar>
+          </w:tcPr>
+          <w:p>
+            <w:pPr>
+              <w:spacing w:before="40" w:after="40"/>
+              <w:rPr>
+                <w:sz w:val="20"/>
+                <w:szCs w:val="20"/>
+              </w:rPr>
+            </w:pPr>
+            <w:r>
+              <w:rPr>
+                <w:sz w:val="20"/>
+                <w:szCs w:val="20"/>
+              </w:rPr>
+              <w:t xml:space="preserve">Pair ceiling recall with specificity and useful corrections.</w:t>
             </w:r>
           </w:p>
         </w:tc>
@@ -49240,7 +49251,7 @@
         </w:trPr>
         <w:tc>
           <w:tcPr>
-            <w:tcW w:w="2160" w:type="dxa"/>
+            <w:tcW w:w="1440" w:type="dxa"/>
             <w:tcMar>
               <w:top w:w="60" w:type="dxa"/>
               <w:left w:w="80" w:type="dxa"/>
@@ -49267,7 +49278,7 @@
         </w:tc>
         <w:tc>
           <w:tcPr>
-            <w:tcW w:w="3600" w:type="dxa"/>
+            <w:tcW w:w="2640" w:type="dxa"/>
             <w:tcMar>
               <w:top w:w="60" w:type="dxa"/>
               <w:left w:w="80" w:type="dxa"/>
@@ -49316,6 +49327,33 @@
                 <w:szCs w:val="20"/>
               </w:rPr>
               <w:t>Not supported: call limit passes, recall-gain and specificity conditions do not</w:t>
+            </w:r>
+          </w:p>
+        </w:tc>
+        <w:tc>
+          <w:tcPr>
+            <w:tcW w:w="1680" w:type="dxa"/>
+            <w:tcMar>
+              <w:top w:w="60" w:type="dxa"/>
+              <w:left w:w="80" w:type="dxa"/>
+              <w:bottom w:w="60" w:type="dxa"/>
+              <w:right w:w="80" w:type="dxa"/>
+            </w:tcMar>
+          </w:tcPr>
+          <w:p>
+            <w:pPr>
+              <w:spacing w:before="40" w:after="40"/>
+              <w:rPr>
+                <w:sz w:val="20"/>
+                <w:szCs w:val="20"/>
+              </w:rPr>
+            </w:pPr>
+            <w:r>
+              <w:rPr>
+                <w:sz w:val="20"/>
+                <w:szCs w:val="20"/>
+              </w:rPr>
+              <w:t xml:space="preserve">Low invocation counts need useful selected repairs.</w:t>
             </w:r>
           </w:p>
         </w:tc>
@@ -49326,7 +49364,7 @@
         </w:trPr>
         <w:tc>
           <w:tcPr>
-            <w:tcW w:w="2160" w:type="dxa"/>
+            <w:tcW w:w="1440" w:type="dxa"/>
             <w:tcMar>
               <w:top w:w="60" w:type="dxa"/>
               <w:left w:w="80" w:type="dxa"/>
@@ -49353,7 +49391,7 @@
         </w:tc>
         <w:tc>
           <w:tcPr>
-            <w:tcW w:w="3600" w:type="dxa"/>
+            <w:tcW w:w="2640" w:type="dxa"/>
             <w:tcMar>
               <w:top w:w="60" w:type="dxa"/>
               <w:left w:w="80" w:type="dxa"/>
@@ -49402,6 +49440,33 @@
                 <w:szCs w:val="20"/>
               </w:rPr>
               <w:t>Representation, computation and control-mechanism findings; no joint diagnostic hypothesis was specified</w:t>
+            </w:r>
+          </w:p>
+        </w:tc>
+        <w:tc>
+          <w:tcPr>
+            <w:tcW w:w="1680" w:type="dxa"/>
+            <w:tcMar>
+              <w:top w:w="60" w:type="dxa"/>
+              <w:left w:w="80" w:type="dxa"/>
+              <w:bottom w:w="60" w:type="dxa"/>
+              <w:right w:w="80" w:type="dxa"/>
+            </w:tcMar>
+          </w:tcPr>
+          <w:p>
+            <w:pPr>
+              <w:spacing w:before="40" w:after="40"/>
+              <w:rPr>
+                <w:sz w:val="20"/>
+                <w:szCs w:val="20"/>
+              </w:rPr>
+            </w:pPr>
+            <w:r>
+              <w:rPr>
+                <w:sz w:val="20"/>
+                <w:szCs w:val="20"/>
+              </w:rPr>
+              <w:t xml:space="preserve">Separate input sensitivity, computation cost and ranking mechanisms.</w:t>
             </w:r>
           </w:p>
         </w:tc>
@@ -49428,23 +49493,7 @@
         <w:ind w:firstLine="720"/>
       </w:pPr>
       <w:r>
-        <w:t xml:space="preserve">The evidence supports three priorities for this gateway: measure expert corrections before widening a gate, assess specificity alongside representation invariance, and evaluate the decision changes produced by monitoring alerts. Count available repairs, selected repairs and introduced errors on labeled data from the intended source. </w:t>
-      </w:r>
-      <w:proofErr w:type="spellStart"/>
-      <w:r>
-        <w:t>Tranco</w:t>
-      </w:r>
-      <w:proofErr w:type="spellEnd"/>
-      <w:r>
-        <w:t xml:space="preserve"> supplies a useful popularity-based control with a different evidential role from certified labels (Le </w:t>
-      </w:r>
-      <w:proofErr w:type="spellStart"/>
-      <w:r>
-        <w:t>Pochat</w:t>
-      </w:r>
-      <w:proofErr w:type="spellEnd"/>
-      <w:r>
-        <w:t xml:space="preserve"> et al., 2019).</w:t>
+        <w:t xml:space="preserve">Three priorities follow for this gateway. Count available expert repairs, selected repairs and new errors on labeled data from the intended source before widening a gate. Test specificity alongside invariance. Judge monitoring by the decisions its alerts change. Tranco supplies a popularity-based control with a different evidential role from certified labels (Le Pochat et al., 2019).</w:t>
       </w:r>
     </w:p>
     <w:p>
@@ -49452,15 +49501,7 @@
         <w:ind w:firstLine="720"/>
       </w:pPr>
       <w:r>
-        <w:t xml:space="preserve">For service design, optimize the measured request path against an explicit response contract. The 99,999 comparable predictions agree while admission order changes and one pair </w:t>
-      </w:r>
-      <w:proofErr w:type="gramStart"/>
-      <w:r>
-        <w:t>times</w:t>
-      </w:r>
-      <w:proofErr w:type="gramEnd"/>
-      <w:r>
-        <w:t xml:space="preserve"> out. Expert counters and p99 expose costs that invocation fractions alone can obscure. These measurements identify what to preserve and what to measure again when hardware, arrival processes or workloads change.</w:t>
+        <w:t xml:space="preserve">Service design requires a measured request path and an explicit response contract. The 99,999 comparable predictions agree; admission order changes and one pair times out. Expert counters and p99 expose costs hidden by invocation fractions. These measurements specify what to preserve and retest when hardware, workloads or arrivals change.</w:t>
       </w:r>
     </w:p>
     <w:p>
@@ -49485,15 +49526,7 @@
         <w:ind w:firstLine="720"/>
       </w:pPr>
       <w:r>
-        <w:t xml:space="preserve">The labels remain publisher assignments without new forensic adjudication. The 2,497 original certified negatives also occupy only 234 domains, so the row count overstates the number of distinct groups. The expanded cohort takes one URL per domain and consequently changes the </w:t>
-      </w:r>
-      <w:proofErr w:type="spellStart"/>
-      <w:r>
-        <w:t>estimand</w:t>
-      </w:r>
-      <w:proofErr w:type="spellEnd"/>
-      <w:r>
-        <w:t>. Its narrower recall interval assumes independent labeled pairs and does not account for cross-domain dependence. Neither sample estimates traffic prevalence.</w:t>
+        <w:t xml:space="preserve">The results use publisher labels without new forensic adjudication. The 2,497 original certified negatives occupy 234 domains, so the number of URLs exceeds the number of distinct groups. Taking one URL per domain in the expanded cohort changes the estimand. Its narrower recall interval assumes independent labeled pairs and does not account for cross-domain dependence. Neither sample estimates traffic prevalence.</w:t>
       </w:r>
     </w:p>
     <w:p>
@@ -49501,15 +49534,7 @@
         <w:ind w:firstLine="720"/>
       </w:pPr>
       <w:r>
-        <w:t xml:space="preserve">Domain separation does not remove shared collection conventions. </w:t>
-      </w:r>
-      <w:proofErr w:type="spellStart"/>
-      <w:r>
-        <w:t>PhiUSIIL</w:t>
-      </w:r>
-      <w:proofErr w:type="spellEnd"/>
-      <w:r>
-        <w:t xml:space="preserve"> lacks independent per-row provenance for a noncircular source-only classifier. The control analyses establish a reproducible contribution from the HTTPS term and broad ranking variation under randomized training labels on fixed partitions. They do not identify how that convention arose or each feature's contribution. Term removal retains correlated predictors, and the 99 permutations describe algorithmic sensitivity rather than independent populations. True validation labels select the five controls' thresholds; historical fits still lack consumed-input authentication.</w:t>
+        <w:t xml:space="preserve">Domain separation leaves shared collection conventions possible. PhiUSIIL lacks the independent per-row provenance needed to fit a noncircular source-only classifier. The controls reproduce a contribution from the HTTPS term and broad ranking variation under randomized training labels on fixed partitions. They do not determine how the convention arose or isolate every feature's contribution. Correlated predictors remain after term removal. The 99 permutations describe algorithmic sensitivity, not independent populations. True validation labels select the five controls' thresholds, and historical fits still lack consumed-input authentication.</w:t>
       </w:r>
     </w:p>
     <w:p>
@@ -49517,15 +49542,7 @@
         <w:ind w:firstLine="720"/>
       </w:pPr>
       <w:r>
-        <w:t xml:space="preserve">The </w:t>
-      </w:r>
-      <w:proofErr w:type="spellStart"/>
-      <w:r>
-        <w:t>url_norm</w:t>
-      </w:r>
-      <w:proofErr w:type="spellEnd"/>
-      <w:r>
-        <w:t xml:space="preserve"> amendment followed preparation and label-count inspection, and checkpoint recovery followed predictions and partial measurement. Earlier exposure and repeated scoring depart from a blind, single-pass evaluation. Wider gates were selected on exposed internal group-test outcomes, so those gains remain exploratory; the gates were fixed before the separate domain-balanced comparison. Models and thresholds stay fixed within the stated comparisons (</w:t>
+        <w:t xml:space="preserve">The analyst's information changed during the study. The url_norm amendment followed preparation and label-count inspection; checkpoint recovery followed predictions and partial measurement. Earlier exposure and repeated scoring differ from a blind, single-pass evaluation. Wider gates were selected using exposed internal group-test outcomes, making those gains exploratory, and fixed before the separate domain-balanced comparison. Models and thresholds remain fixed within the stated comparisons (</w:t>
       </w:r>
       <w:hyperlink w:anchor="revision_heading_4018" w:history="1">
         <w:r>
@@ -49533,11 +49550,7 @@
         </w:r>
       </w:hyperlink>
       <w:r>
-        <w:t xml:space="preserve">). Overlapping GMM windows and activations across domains also make saved-outcome resampling conditional on stream </w:t>
-      </w:r>
-      <w:r>
-        <w:lastRenderedPageBreak/>
-        <w:t>order. Label-free probes establish neither semantic preservation nor real-world adversarial robustness.</w:t>
+        <w:t xml:space="preserve">). Overlapping GMM windows and activations across domains make saved-outcome resampling conditional on stream order. Label-free probes demonstrate neither semantic preservation nor real-world adversarial robustness.</w:t>
       </w:r>
     </w:p>
     <w:p>
@@ -49545,7 +49558,7 @@
         <w:ind w:firstLine="720"/>
       </w:pPr>
       <w:r>
-        <w:t>Operational measurements come from one host, fixed workload order and two original sessions. Session, thermal, cache and elapsed-time effects cannot be separated, and closed-loop timing excludes unsent backlog. Comparison D uses a retrospective publisher-labeled benchmark with shared upstream mechanisms and conflicting collection-month descriptions. Domain exclusions do not establish temporal independence. Refitting and recalibration are part of its combined intervention, while the companions test representation behavior rather than live-site equivalence.</w:t>
+        <w:t xml:space="preserve">The operational measurements use one host, a fixed workload order and two original sessions. Session, thermal, cache and elapsed-time effects cannot be separated; closed-loop timing also excludes unsent backlog. Comparison D uses a retrospective publisher-labeled benchmark with shared upstream mechanisms and conflicting collection-month descriptions. Excluding domains does not establish temporal independence. D combines refitting and recalibration with normalization, while its companions test representation behavior rather than live-site equivalence.</w:t>
       </w:r>
     </w:p>
     <w:p>
@@ -49553,15 +49566,7 @@
         <w:ind w:firstLine="720"/>
       </w:pPr>
       <w:r>
-        <w:t xml:space="preserve">The cost experiments address different workloads. S uses ten primary run pairs of synthetic structural-only HTTP requests. C uses real strings at concurrency one, a designed 1% mixture and five cyclic rotations. Its positions are not fully balanced, and it has no run-level confidence interval. The two experiments cannot be combined to establish a transformer-service speedup. Sampled host checks document observed </w:t>
-      </w:r>
-      <w:proofErr w:type="gramStart"/>
-      <w:r>
-        <w:t>conditions, and</w:t>
-      </w:r>
-      <w:proofErr w:type="gramEnd"/>
-      <w:r>
-        <w:t xml:space="preserve"> saved-evidence calculations verify arithmetic. Neither establishes disturbance-free operation or independent replication.</w:t>
+        <w:t xml:space="preserve">The cost experiments measure different workloads. S uses ten primary run pairs of synthetic structural-only HTTP requests. C uses real strings at concurrency one, a designed 1% mixture and five cyclic rotations; its positions are not fully balanced, and it has no run-level confidence interval. Combining them would not establish a transformer-service speedup. Sampled host checks record observed conditions, and saved-evidence calculations verify arithmetic. Neither proves disturbance-free operation or independent replication.</w:t>
       </w:r>
     </w:p>
     <w:p>
@@ -49585,7 +49590,7 @@
         <w:ind w:firstLine="720"/>
       </w:pPr>
       <w:r>
-        <w:t>The next experiments follow directly from the design evidence. Independently adjudicated, time-indexed sources with formatting conventions recorded separately from outcome would test transferable discrimination and expert corrections. Service studies should balance workload and session order, use open-loop arrivals, and evaluate admission order separately from prediction equality. Each extends a measured component of the present work.</w:t>
+        <w:t xml:space="preserve">Independently adjudicated, time-indexed sources recording formatting separately from outcome would test transferable discrimination and expert corrections. Balanced workload and session order, open-loop arrivals and separate admission-order tests would extend the service evidence.</w:t>
       </w:r>
     </w:p>
     <w:p>
@@ -49610,7 +49615,7 @@
         <w:ind w:firstLine="720"/>
       </w:pPr>
       <w:r>
-        <w:t xml:space="preserve">CyberSentinel connects URL representation, monitoring and selective execution to measured outcomes. Structural features add 64.07 percentage points of internal recall within the benchmark. Validation controls identify format–class association, and a fixed-weight intervention establishes external scheme sensitivity. A separate refit achieves exact invariance across 8,622 pairs with a quantified reduction in both true and false positives. Together, these experiments provide concrete tests of representation stability and its consequences for labeled detection.</w:t>
+        <w:t xml:space="preserve">CyberSentinel provides a working gateway and controlled design evidence. Structural features add 64.07 percentage points of internal recall. Validation controls reveal format–class association; a fixed-weight intervention establishes external scheme sensitivity. A separate refit removes that sensitivity across 8,622 pairs while reducing true and false positives, distinguishing stability from detection quality.</w:t>
       </w:r>
     </w:p>
     <w:p>
@@ -49618,7 +49623,7 @@
         <w:ind w:firstLine="720"/>
       </w:pPr>
       <w:r>
-        <w:t>Monitoring and routing experiments make expert value measurable. External-window sensitivity reaches 87.12%, while escalation adds 218 false positives without another gold detection. The models' 2,261 common false positives among 2,497 negatives establish a 90.5487% floor for selection between unchanged decisions. Wider gates on a separate cohort select no repairs and add 18 false positives. Available corrections and selected outcomes therefore guide expert and policy design.</w:t>
+        <w:t xml:space="preserve">External-window sensitivity reaches 87.12%; escalation adds 218 false positives without another gold detection. The models' 2,261 shared false positives among 2,497 certified negatives impose an exact 90.5487% floor on unchanged-decision selection. Wider gates on a separate cohort select no repairs and add 18 false positives. Count available corrections before choosing an expert; evaluate the policy by its selections.</w:t>
       </w:r>
     </w:p>
     <w:p>
@@ -49626,7 +49631,7 @@
         <w:ind w:firstLine="720"/>
       </w:pPr>
       <w:r>
-        <w:t>Worker-owned clients reduce median paired HTTP p95 by 79.68% in the single-host synthetic structural-only setup. A no-model control supports the client-path explanation; comparable predictions agree despite changed admission order. Expert scoring cost is measured separately. H1–H3 retain their original joint criteria. The resulting design guidance is concrete: test format dependence, select experts for useful corrections, follow alerts into decisions, and optimize the execution path identified by measurement.</w:t>
+        <w:t xml:space="preserve">Worker-owned clients reduce median paired HTTP p95 by 79.68% in the single-host synthetic structural-only setup. A no-model control supports the client-path explanation; comparable predictions agree despite changed admission order. Expert scoring cost is measured separately. The complete gateway did not meet the prespecified joint criteria of H1–H3; the experiments identify what a redesign must address. CyberSentinel provides the next designer with a working architecture, a measured service improvement, a benchmark check and an exact routing bound.</w:t>
       </w:r>
     </w:p>
     <w:p>

</xml_diff>

<commit_message>
docs: polish thesis and Chapter 5 research narrative
</commit_message>
<xml_diff>
--- a/dissertation/2026-10-15/manuscript/Tallam_Krti_Praxis_Strengthened_2026-10-15.docx
+++ b/dissertation/2026-10-15/manuscript/Tallam_Krti_Praxis_Strengthened_2026-10-15.docx
@@ -2991,7 +2991,7 @@
         <w:fldChar w:fldCharType="separate"/>
       </w:r>
       <w:r>
-        <w:t>98</w:t>
+        <w:t>99</w:t>
       </w:r>
       <w:r>
         <w:fldChar w:fldCharType="end"/>
@@ -4378,7 +4378,7 @@
         <w:fldChar w:fldCharType="separate"/>
       </w:r>
       <w:r>
-        <w:t>96</w:t>
+        <w:t>97</w:t>
       </w:r>
       <w:r>
         <w:fldChar w:fldCharType="end"/>
@@ -5356,7 +5356,7 @@
         <w:rPr>
           <w:i/>
         </w:rPr>
-        <w:t xml:space="preserve">CyberSentinel demonstrates how to evaluate a URL gateway as a connected system: measure the information its features supply, the corrections its expert can make and the cost of execution. The experiments reveal a benchmark-format dependency, derive an exact routing constraint and verify a client-path improvement. These findings guide representation, expert and service design.</w:t>
+        <w:t xml:space="preserve">CyberSentinel shows how to judge a URL gateway as a connected system: by the signals behind its predictions, the corrections its expert can make and the time spent serving each request. Its experiments uncover a URL-format convention in the benchmark, derive an exact limit on routing between unchanged decisions and verify a 79.68% reduction in median paired p95 latency in the single-host synthetic structural-only service. Together, these findings turn measured model and service behavior into specific decisions about representation, expert selection and implementation.</w:t>
       </w:r>
     </w:p>
     <w:p>
@@ -47068,7 +47068,7 @@
         <w:ind w:firstLine="720"/>
       </w:pPr>
       <w:r>
-        <w:t xml:space="preserve">CyberSentinel answers Research Questions 1–3 (RQ1–RQ3) through an implemented gateway and controlled experiments. The structural model supplies a substantial internal recall gain; subsequent comparisons investigate its dependencies, available expert corrections and service improvements. </w:t>
+        <w:t xml:space="preserve">CyberSentinel answers Research Questions 1–3 (RQ1–RQ3) by connecting the gateway's design choices to measured outcomes. The structural model delivers a substantial internal recall gain, and controlled comparisons examine the signals behind its decisions, the corrections available from an expert and the costs that can be reduced in the service. </w:t>
       </w:r>
       <w:hyperlink w:anchor="table_17" w:history="1">
         <w:r>
@@ -47079,7 +47079,7 @@
         </w:r>
       </w:hyperlink>
       <w:r>
-        <w:t xml:space="preserve"> gives the hypothesis decisions. The answers below develop their implications for design.</w:t>
+        <w:t xml:space="preserve"> records the formal hypothesis decisions; the discussion below explains what these measurements contribute to gateway design.</w:t>
       </w:r>
     </w:p>
     <w:p>
@@ -47087,7 +47087,7 @@
         <w:ind w:firstLine="720"/>
       </w:pPr>
       <w:r>
-        <w:t xml:space="preserve">RQ1—Representation and transfer. Structural features add 64.07 percentage points of internal recall over length alone, with a 95% domain-clustered interval [59.99, 67.63], at false-positive rate (FPR) 0.7747%. Validation labels also follow a format convention whose share of the gain is unquantified. External certified FPR is 90.5487%, versus 9.4513% for length-only; the cascade adds no recall or expert calls (</w:t>
+        <w:t xml:space="preserve">RQ1—Representation and transfer. Structural features add 64.07 percentage points of internal recall over length alone, with a 95% domain-clustered interval [59.99, 67.63], at false-positive rate (FPR) 0.7747%. Validation labels also follow a URL-format convention, although the experiments do not quantify how much of the gain comes from that association. On external certified negatives, FPR is 90.5487%, versus 9.4513% for length-only, while the cascade adds no recall or expert calls (</w:t>
       </w:r>
       <w:hyperlink w:anchor="table_4_2_summary" w:history="1">
         <w:r>
@@ -47103,7 +47103,7 @@
         </w:r>
       </w:hyperlink>
       <w:r>
-        <w:t xml:space="preserve">). This finding motivates checking the signals behind a feature gain and measuring specificity on the intended source.</w:t>
+        <w:t xml:space="preserve">). A feature gain is therefore most informative when its underlying signals and specificity are also tested on the intended source.</w:t>
       </w:r>
     </w:p>
     <w:p>
@@ -47111,7 +47111,7 @@
         <w:ind w:firstLine="720"/>
       </w:pPr>
       <w:r>
-        <w:t xml:space="preserve">The interventions make that test concrete. Scheme spelling changes frozen-model decisions. A separate refit removes scheme sensitivity while reducing true and false positives; its combined fitting and calibration changes require their own labeled evaluation. Paired outputs establish which errors an expert can correct. Shared errors survive every selection between those unchanged decisions.</w:t>
+        <w:t xml:space="preserve">The controlled interventions show how to make that assessment. Changing scheme spelling changes frozen-model decisions, while a separate refit removes scheme sensitivity and reduces both true and false positives. Because the refit changes fitting and calibration together, its detection behavior requires its own labeled evaluation. Comparing both models on the same inputs then reveals which errors the expert can correct: if both misclassify a URL, choosing between their existing decisions leaves that error in place.</w:t>
       </w:r>
     </w:p>
     <w:p>
@@ -47119,7 +47119,7 @@
         <w:ind w:firstLine="720"/>
       </w:pPr>
       <w:r>
-        <w:t xml:space="preserve">RQ2—Monitoring and action. The GMM recognizes 115/132 external windows (87.12%), exceeding its 80% target. Its audit alerts are 28/252 windows (11.11%) against 5%, so sensitivity and false alerts must be assessed together. Ordered, stateful replay sends 8,253/8,701 requests (94.8512%) to the expert. The policy retains 69/69 gold detections and adds 218 certified false positives (</w:t>
+        <w:t xml:space="preserve">RQ2—Monitoring and action. The GMM recognizes 115/132 external windows (87.12%), exceeding its 80% target, with 28/252 audit alerts (11.11%) against a 5% limit. Sensitivity and false alerts together describe the monitor's behavior; paired decisions show what its response contributes. Ordered, stateful replay sends 8,253/8,701 requests (94.8512%) to the expert, retaining 69/69 gold detections and adding 218 certified false positives (</w:t>
       </w:r>
       <w:hyperlink w:anchor="table_8" w:history="1">
         <w:r>
@@ -47127,7 +47127,7 @@
         </w:r>
       </w:hyperlink>
       <w:r>
-        <w:t xml:space="preserve">). Recognizing a change in inputs does not tell a gateway which response will help. Following alerts into paired decisions supplies that test.</w:t>
+        <w:t xml:space="preserve">). This comparison gives monitoring a concrete design test: follow an alert through the routing decision and check whether the selected expert improves the outcome.</w:t>
       </w:r>
     </w:p>
     <w:p>
@@ -47135,7 +47135,7 @@
         <w:ind w:firstLine="720"/>
       </w:pPr>
       <w:r>
-        <w:t xml:space="preserve">RQ3—Inline tradeoffs. The fixed cascade meets the invocation and primary request-error limits. Pooled p95 is 364.30 ms against a 200 ms budget, and external false-alert safeguards are exceeded. The original 69-pair recall sample gives a corrected lower bound of −6.1533 percentage points under independent labeled-pair assumptions. That bound leaves the −2-point noninferiority margin unresolved; it does not establish inferiority (</w:t>
+        <w:t xml:space="preserve">RQ3—Inline tradeoffs. The fixed cascade meets the invocation and primary request-error limits, while pooled p95 is 364.30 ms against a 200 ms budget and external false-alert safeguards are exceeded. The original 69-pair recall sample gives a corrected lower bound of −6.1533 percentage points under independent labeled-pair assumptions, leaving the −2-point noninferiority margin unresolved without demonstrating inferiority (</w:t>
       </w:r>
       <w:hyperlink w:anchor="table_9" w:history="1">
         <w:r>
@@ -47159,7 +47159,7 @@
         </w:r>
       </w:hyperlink>
       <w:r>
-        <w:t xml:space="preserve">). Measuring these quantities separately reveals where to intervene: detector computation and request handling need distinct experiments, alongside detection quality.</w:t>
+        <w:t xml:space="preserve">). These measurements make detector computation, request handling and detection quality distinct engineering targets, with a separate test for each.</w:t>
       </w:r>
     </w:p>
     <w:p>
@@ -47167,7 +47167,7 @@
         <w:ind w:firstLine="720"/>
       </w:pPr>
       <w:r>
-        <w:t xml:space="preserve">Worker-owned clients improve the synthetic structural-only service; separate scoring tests quantify transformer cost. These experiments connect a proposed change to a measurable consequence. Representation stability is tested with labeled detection, expert selection with corrections, and monitoring with the decisions its alerts change.</w:t>
+        <w:t xml:space="preserve">The client comparison turns that distinction into an improvement: worker-owned clients speed up the synthetic structural-only service, while separate scoring tests quantify transformer cost. Across these experiments, the same principle guides evaluation: assess representation stability together with labeled detection, select experts by the errors they correct, and judge monitoring by the decisions its alerts change.</w:t>
       </w:r>
     </w:p>
     <w:p>
@@ -47191,7 +47191,7 @@
         <w:ind w:firstLine="720"/>
       </w:pPr>
       <w:r>
-        <w:t xml:space="preserve">The benchmark investigation gives URL researchers a concrete check. All 20,209 validation negatives use HTTPS, versus 46.6362% of positives; the negative HTTPS indicator reaches AUC 0.7668. The fixed-weight external intervention also changes decisions. These findings justify checking format conventions before interpreting a gain as transferable detection, without quantifying the HTTPS-attributable fraction. Paired errors establish available expert corrections (</w:t>
+        <w:t xml:space="preserve">The benchmark investigation gives URL researchers a simple check to add to evaluation: inspect whether formatting conventions track class labels. All 20,209 validation negatives use HTTPS, versus 46.6362% of positives, and the negative HTTPS indicator reaches AUC 0.7668. The fixed-weight external intervention also changes decisions, supporting a check of format dependence before interpreting a gain as transferable detection. These tests do not quantify the HTTPS-attributable fraction of the gain. Paired error analysis then identifies the corrections available from an expert (</w:t>
       </w:r>
       <w:hyperlink w:anchor="heading_54" w:history="1">
         <w:r>
@@ -47214,6 +47214,9 @@
       <w:pPr>
         <w:ind w:firstLine="720"/>
       </w:pPr>
+      <w:r>
+        <w:t xml:space="preserve">The two interventions answer complementary questions: </w:t>
+      </w:r>
       <w:hyperlink w:anchor="revision_table_4011" w:history="1">
         <w:r>
           <w:rPr>
@@ -47223,7 +47226,7 @@
         </w:r>
       </w:hyperlink>
       <w:r>
-        <w:t xml:space="preserve"> tests spelling changes with weights fixed. </w:t>
+        <w:t xml:space="preserve"> tests spelling changes with weights fixed, whereas </w:t>
       </w:r>
       <w:hyperlink w:anchor="table_19" w:history="1">
         <w:r>
@@ -47245,7 +47248,7 @@
         </w:r>
       </w:hyperlink>
       <w:r>
-        <w:t xml:space="preserve"> verify exact scheme invariance after refitting and quantify detection changes. Different cohorts and fitting procedures prevent attributing the refit's effect to normalization alone. Together, the internal association and external intervention support a practical benchmark check; collection-source causality remains unresolved.</w:t>
+        <w:t xml:space="preserve"> verify exact scheme invariance after refitting and measure the accompanying detection changes. Because the cohorts and fitting procedures differ, the refit's effect cannot be attributed to normalization alone. The internal association and external intervention therefore support a practical benchmark check while leaving the role of collection source as a separate causal question.</w:t>
       </w:r>
     </w:p>
     <w:p>
@@ -47253,7 +47256,7 @@
         <w:ind w:firstLine="720"/>
       </w:pPr>
       <w:r>
-        <w:t xml:space="preserve">Routing provides an exact design constraint: 2,261 shared false positives among 2,497 certified negatives impose a 90.5487% floor on unchanged-decision selection. Escalation adds 218 false positives without another gold detection. On the separate cohort, one expert repair is available, but wider gates select none and add 18 false positives. Count available corrections before tuning a gate. Service tests identify a client-path improvement with matching comparable predictions despite changed admission order (</w:t>
+        <w:t xml:space="preserve">The study's clearest routing result is also its simplest: when both models make the same mistake, choosing between their unchanged decisions cannot correct it. Here, 2,261 shared false positives among 2,497 certified negatives set an exact 90.5487% false-positive floor. Escalation adds 218 false positives without another gold detection; on the separate cohort, one expert repair is available, but wider gates select none and add 18 false positives. Count available corrections before tuning a gate. Service tests show a client-path improvement with matching comparable predictions despite changed admission order (</w:t>
       </w:r>
       <w:hyperlink w:anchor="table_21" w:history="1">
         <w:r>
@@ -47275,7 +47278,7 @@
         </w:r>
       </w:hyperlink>
       <w:r>
-        <w:t xml:space="preserve">). </w:t>
+        <w:t xml:space="preserve">); </w:t>
       </w:r>
       <w:hyperlink w:anchor="revision_table_4015" w:history="1">
         <w:r>
@@ -47302,7 +47305,7 @@
         <w:ind w:firstLine="720"/>
       </w:pPr>
       <w:r>
-        <w:t xml:space="preserve">The recall-only analysis supports noninferiority conditional on independent labeled pairs. Every model detects every positive while flagging most negatives; the original gate calls no expert, and the wider gate adds false positives. Specificity and selected corrections therefore determine the practical value of the preserved recall. Reused observations provide neither independent replication nor guaranteed campaign independence.</w:t>
+        <w:t xml:space="preserve">The recall-only analysis supports noninferiority conditional on independent labeled pairs. Every model detects every positive while flagging most negatives; the original gate calls no expert, and the wider gate adds false positives. The practical value of that preserved recall therefore depends on specificity and the corrections actually selected. Because the comparisons reuse observations, they do not provide independent replications or guarantee independence across campaigns.</w:t>
       </w:r>
     </w:p>
     <w:p>
@@ -48309,7 +48312,7 @@
         </w:r>
       </w:hyperlink>
       <w:r>
-        <w:t xml:space="preserve"> connects inputs, fitted states, outcomes and diagnostics. Input audits, reconstructed scores, permutations and convergence checks support the ranking explanation. </w:t>
+        <w:t xml:space="preserve"> links inputs, fitted states, outcomes and diagnostics so that audits, reconstructed scores, permutations and convergence checks can support the ranking explanation. </w:t>
       </w:r>
       <w:hyperlink w:anchor="revision_heading_4018" w:history="1">
         <w:r>
@@ -48317,7 +48320,7 @@
         </w:r>
       </w:hyperlink>
       <w:r>
-        <w:t xml:space="preserve"> records information exposure and execution history. This record makes the analyzed fits reproducible; historical-fit authentication and independent replication remain separate requirements.</w:t>
+        <w:t xml:space="preserve"> records information exposure and execution history, preserving reproducibility while keeping historical-fit authentication and independent replication distinct.</w:t>
       </w:r>
     </w:p>
     <w:p>
@@ -48325,7 +48328,7 @@
         <w:ind w:firstLine="720"/>
       </w:pPr>
       <w:r>
-        <w:t xml:space="preserve">The shuffled-label investigation explains a puzzling control result. Small residual coefficients can rank format-associated labels well despite nearly constant probabilities. Input audits check the fitted data, term removal measures one contribution, randomization reproduces the spread, and stricter optimization preserves it. Inspecting coefficients and score ordering alongside mean probability provides a practical test of such controls.</w:t>
+        <w:t xml:space="preserve">The shuffled-label investigation shows how small residual coefficients rank format-associated labels despite nearly constant probabilities. Input audits check the data, term removal measures one contribution, and randomization and stricter optimization confirm persistent ranking variation. Coefficients, score ordering and mean probability together make these controls interpretable.</w:t>
       </w:r>
     </w:p>
     <w:p>
@@ -48352,7 +48355,7 @@
         </w:r>
       </w:hyperlink>
       <w:r>
-        <w:t xml:space="preserve"> connects component findings, complete gateway decisions and engineering insight. The internal feature gain, routing bound, scheme invariance and client-path improvement each answer a design question. Joint H1–H3 decisions determine system-level qualification. The contribution is a measured basis for redesign: what to change, why it matters and how to test its consequences.</w:t>
+        <w:t xml:space="preserve"> pairs each formal decision with its engineering insight. Alongside the joint H1–H3 criteria, the internal feature gain, exact routing bound, scheme invariance and client-path improvement tell the next designer what to change, why it matters and how to test the result.</w:t>
       </w:r>
     </w:p>
     <w:p>

</xml_diff>

<commit_message>
docs: refine conclusion flow and preserve final manuscript layout
</commit_message>
<xml_diff>
--- a/dissertation/2026-10-15/manuscript/Tallam_Krti_Praxis_Strengthened_2026-10-15.docx
+++ b/dissertation/2026-10-15/manuscript/Tallam_Krti_Praxis_Strengthened_2026-10-15.docx
@@ -49618,7 +49618,7 @@
         <w:ind w:firstLine="720"/>
       </w:pPr>
       <w:r>
-        <w:t xml:space="preserve">CyberSentinel provides a working gateway and controlled design evidence. Structural features add 64.07 percentage points of internal recall. Validation controls reveal format–class association; a fixed-weight intervention establishes external scheme sensitivity. A separate refit removes that sensitivity across 8,622 pairs while reducing true and false positives, distinguishing stability from detection quality.</w:t>
+        <w:t xml:space="preserve">CyberSentinel shows how to judge a gateway as a whole system. Structural features add 64.07 percentage points of internal recall, while controls reveal format–class association and fixed-weight tests show external scheme sensitivity. A separate refit removes that sensitivity across 8,622 pairs while reducing true and false positives together, showing why stability and detection quality need separate tests.</w:t>
       </w:r>
     </w:p>
     <w:p>
@@ -49626,7 +49626,7 @@
         <w:ind w:firstLine="720"/>
       </w:pPr>
       <w:r>
-        <w:t xml:space="preserve">External-window sensitivity reaches 87.12%; escalation adds 218 false positives without another gold detection. The models' 2,261 shared false positives among 2,497 certified negatives impose an exact 90.5487% floor on unchanged-decision selection. Wider gates on a separate cohort select no repairs and add 18 false positives. Count available corrections before choosing an expert; evaluate the policy by its selections.</w:t>
+        <w:t xml:space="preserve">Choosing between the models' unchanged decisions carries a 90.5487% false-positive floor: 2,261 shared false positives among 2,497 certified negatives. Wider gates on a separate cohort add 18 false positives without repairs. The monitor recognizes 87.12% of external windows, yet escalation adds 218 false positives without another gold detection. Count available corrections; judge policies by their decisions.</w:t>
       </w:r>
     </w:p>
     <w:p>
@@ -49634,7 +49634,7 @@
         <w:ind w:firstLine="720"/>
       </w:pPr>
       <w:r>
-        <w:t xml:space="preserve">Worker-owned clients reduce median paired HTTP p95 by 79.68% in the single-host synthetic structural-only setup. A no-model control supports the client-path explanation; comparable predictions agree despite changed admission order. Expert scoring cost is measured separately. The complete gateway did not meet the prespecified joint criteria of H1–H3; the experiments identify what a redesign must address. CyberSentinel provides the next designer with a working architecture, a measured service improvement, a benchmark check and an exact routing bound.</w:t>
+        <w:t xml:space="preserve">Worker-owned clients cut median paired HTTP p95 by 79.68% in the single-host synthetic structural-only setup. The no-model control supports the client-path explanation, while comparable predictions agree despite changed admission order; expert scoring cost is measured separately. The complete gateway did not meet the prespecified joint criteria of H1–H3; the experiments identify what a redesign must address. CyberSentinel leaves the next designer a working architecture, a measured service improvement, a benchmark check and an exact routing bound.</w:t>
       </w:r>
     </w:p>
     <w:p>

</xml_diff>